<commit_message>
CI: agregar job de calidad con ESLint y npm audit
</commit_message>
<xml_diff>
--- a/infrome9.docx
+++ b/infrome9.docx
@@ -1328,7 +1328,7 @@
         <w:tblLook w:val="04A0" w:firstRow="1" w:lastRow="0" w:firstColumn="1" w:lastColumn="0" w:noHBand="0" w:noVBand="1"/>
       </w:tblPr>
       <w:tblGrid>
-        <w:gridCol w:w="9950"/>
+        <w:gridCol w:w="9746"/>
       </w:tblGrid>
       <w:tr>
         <w:trPr>
@@ -1351,18 +1351,12 @@
               <w:jc w:val="center"/>
             </w:pPr>
             <w:r>
-              <w:rPr>
-                <w:i/>
-                <w:iCs/>
-                <w:noProof/>
-                <w:color w:val="8F9EAA"/>
-              </w:rPr>
               <w:lastRenderedPageBreak/>
               <w:drawing>
-                <wp:inline distT="0" distB="0" distL="0" distR="0" wp14:anchorId="43C93D03" wp14:editId="1A367BB3">
-                  <wp:extent cx="6188710" cy="1963420"/>
-                  <wp:effectExtent l="0" t="0" r="2540" b="0"/>
-                  <wp:docPr id="368930097" name="Imagen 1"/>
+                <wp:inline distT="0" distB="0" distL="0" distR="0" wp14:anchorId="27646D1E" wp14:editId="52BAD0D8">
+                  <wp:extent cx="5067739" cy="3276884"/>
+                  <wp:effectExtent l="0" t="0" r="0" b="0"/>
+                  <wp:docPr id="789381397" name="Imagen 1"/>
                   <wp:cNvGraphicFramePr>
                     <a:graphicFrameLocks xmlns:a="http://schemas.openxmlformats.org/drawingml/2006/main" noChangeAspect="1"/>
                   </wp:cNvGraphicFramePr>
@@ -1370,7 +1364,7 @@
                     <a:graphicData uri="http://schemas.openxmlformats.org/drawingml/2006/picture">
                       <pic:pic xmlns:pic="http://schemas.openxmlformats.org/drawingml/2006/picture">
                         <pic:nvPicPr>
-                          <pic:cNvPr id="368930097" name=""/>
+                          <pic:cNvPr id="789381397" name=""/>
                           <pic:cNvPicPr/>
                         </pic:nvPicPr>
                         <pic:blipFill>
@@ -1382,7 +1376,7 @@
                         <pic:spPr>
                           <a:xfrm>
                             <a:off x="0" y="0"/>
-                            <a:ext cx="6188710" cy="1963420"/>
+                            <a:ext cx="5067739" cy="3276884"/>
                           </a:xfrm>
                           <a:prstGeom prst="rect">
                             <a:avLst/>
@@ -1471,7 +1465,7 @@
           </w:tcPr>
           <w:p>
             <w:r>
-              <w:t>Porque si las pruebas no pasan en tu equipo, el pipeline en GitHub va a fallar igual: solo estarías trasladando el error a otra máquina. Probar en local asegura que el código funciona antes de automatizarlo, y así el pipeline solo confirma lo que ya sabes que está bien.</w:t>
+              <w:t>Porque el pipeline en GitHub corre sobre una máquina limpia, sin mi código ni mi entorno. Si las pruebas fallan en mi equipo, van a fallar igual en el runner: subir código roto solo traslada el problema. Probar en local me asegura que automatizo algo que ya sé que funciona.</w:t>
             </w:r>
           </w:p>
         </w:tc>
@@ -1548,17 +1542,12 @@
               <w:jc w:val="center"/>
             </w:pPr>
             <w:r>
-              <w:rPr>
-                <w:i/>
-                <w:iCs/>
-                <w:color w:val="8F9EAA"/>
-              </w:rPr>
               <w:lastRenderedPageBreak/>
               <w:drawing>
-                <wp:inline distT="0" distB="0" distL="0" distR="0" wp14:anchorId="4AB56C1C" wp14:editId="2D015A12">
-                  <wp:extent cx="6188710" cy="3269615"/>
-                  <wp:effectExtent l="0" t="0" r="2540" b="6985"/>
-                  <wp:docPr id="943681458" name="Imagen 1"/>
+                <wp:inline distT="0" distB="0" distL="0" distR="0" wp14:anchorId="5BADE45D" wp14:editId="391EB228">
+                  <wp:extent cx="6188710" cy="3164205"/>
+                  <wp:effectExtent l="0" t="0" r="2540" b="0"/>
+                  <wp:docPr id="1457806979" name="Imagen 1"/>
                   <wp:cNvGraphicFramePr>
                     <a:graphicFrameLocks xmlns:a="http://schemas.openxmlformats.org/drawingml/2006/main" noChangeAspect="1"/>
                   </wp:cNvGraphicFramePr>
@@ -1566,7 +1555,7 @@
                     <a:graphicData uri="http://schemas.openxmlformats.org/drawingml/2006/picture">
                       <pic:pic xmlns:pic="http://schemas.openxmlformats.org/drawingml/2006/picture">
                         <pic:nvPicPr>
-                          <pic:cNvPr id="943681458" name=""/>
+                          <pic:cNvPr id="1457806979" name=""/>
                           <pic:cNvPicPr/>
                         </pic:nvPicPr>
                         <pic:blipFill>
@@ -1578,7 +1567,7 @@
                         <pic:spPr>
                           <a:xfrm>
                             <a:off x="0" y="0"/>
-                            <a:ext cx="6188710" cy="3269615"/>
+                            <a:ext cx="6188710" cy="3164205"/>
                           </a:xfrm>
                           <a:prstGeom prst="rect">
                             <a:avLst/>
@@ -1670,6 +1659,1402 @@
       <w:proofErr w:type="spellEnd"/>
       <w:r>
         <w:t xml:space="preserve"> y el resultado en verde.</w:t>
+      </w:r>
+    </w:p>
+    <w:tbl>
+      <w:tblPr>
+        <w:tblW w:w="9746" w:type="dxa"/>
+        <w:tblBorders>
+          <w:top w:val="dashed" w:sz="4" w:space="0" w:color="D6DEE5"/>
+          <w:left w:val="dashed" w:sz="4" w:space="0" w:color="D6DEE5"/>
+          <w:bottom w:val="dashed" w:sz="4" w:space="0" w:color="D6DEE5"/>
+          <w:right w:val="dashed" w:sz="4" w:space="0" w:color="D6DEE5"/>
+          <w:insideH w:val="single" w:sz="4" w:space="0" w:color="auto"/>
+          <w:insideV w:val="single" w:sz="4" w:space="0" w:color="auto"/>
+        </w:tblBorders>
+        <w:tblCellMar>
+          <w:left w:w="10" w:type="dxa"/>
+          <w:right w:w="10" w:type="dxa"/>
+        </w:tblCellMar>
+        <w:tblLook w:val="04A0" w:firstRow="1" w:lastRow="0" w:firstColumn="1" w:lastColumn="0" w:noHBand="0" w:noVBand="1"/>
+      </w:tblPr>
+      <w:tblGrid>
+        <w:gridCol w:w="9950"/>
+      </w:tblGrid>
+      <w:tr>
+        <w:trPr>
+          <w:trHeight w:val="2100"/>
+        </w:trPr>
+        <w:tc>
+          <w:tcPr>
+            <w:tcW w:w="9746" w:type="dxa"/>
+            <w:tcMar>
+              <w:top w:w="60" w:type="dxa"/>
+              <w:left w:w="100" w:type="dxa"/>
+              <w:bottom w:w="60" w:type="dxa"/>
+              <w:right w:w="100" w:type="dxa"/>
+            </w:tcMar>
+            <w:vAlign w:val="center"/>
+          </w:tcPr>
+          <w:p>
+            <w:pPr>
+              <w:spacing w:before="800" w:after="800"/>
+              <w:jc w:val="center"/>
+            </w:pPr>
+            <w:r>
+              <w:lastRenderedPageBreak/>
+              <w:drawing>
+                <wp:inline distT="0" distB="0" distL="0" distR="0" wp14:anchorId="2D775C10" wp14:editId="5713AD99">
+                  <wp:extent cx="6188710" cy="3234055"/>
+                  <wp:effectExtent l="0" t="0" r="2540" b="4445"/>
+                  <wp:docPr id="482431157" name="Imagen 1"/>
+                  <wp:cNvGraphicFramePr>
+                    <a:graphicFrameLocks xmlns:a="http://schemas.openxmlformats.org/drawingml/2006/main" noChangeAspect="1"/>
+                  </wp:cNvGraphicFramePr>
+                  <a:graphic xmlns:a="http://schemas.openxmlformats.org/drawingml/2006/main">
+                    <a:graphicData uri="http://schemas.openxmlformats.org/drawingml/2006/picture">
+                      <pic:pic xmlns:pic="http://schemas.openxmlformats.org/drawingml/2006/picture">
+                        <pic:nvPicPr>
+                          <pic:cNvPr id="482431157" name=""/>
+                          <pic:cNvPicPr/>
+                        </pic:nvPicPr>
+                        <pic:blipFill>
+                          <a:blip r:embed="rId10"/>
+                          <a:stretch>
+                            <a:fillRect/>
+                          </a:stretch>
+                        </pic:blipFill>
+                        <pic:spPr>
+                          <a:xfrm>
+                            <a:off x="0" y="0"/>
+                            <a:ext cx="6188710" cy="3234055"/>
+                          </a:xfrm>
+                          <a:prstGeom prst="rect">
+                            <a:avLst/>
+                          </a:prstGeom>
+                        </pic:spPr>
+                      </pic:pic>
+                    </a:graphicData>
+                  </a:graphic>
+                </wp:inline>
+              </w:drawing>
+            </w:r>
+          </w:p>
+        </w:tc>
+      </w:tr>
+    </w:tbl>
+    <w:p>
+      <w:pPr>
+        <w:spacing w:after="160"/>
+      </w:pPr>
+    </w:p>
+    <w:p>
+      <w:pPr>
+        <w:spacing w:after="80" w:line="260" w:lineRule="auto"/>
+        <w:jc w:val="both"/>
+      </w:pPr>
+      <w:r>
+        <w:rPr>
+          <w:b/>
+          <w:bCs/>
+          <w:color w:val="D97A2B"/>
+        </w:rPr>
+        <w:t xml:space="preserve">Captura N.º 4: </w:t>
+      </w:r>
+      <w:r>
+        <w:t xml:space="preserve">detalle del </w:t>
+      </w:r>
+      <w:proofErr w:type="spellStart"/>
+      <w:r>
+        <w:t>job</w:t>
+      </w:r>
+      <w:proofErr w:type="spellEnd"/>
+      <w:r>
+        <w:t xml:space="preserve"> desplegado, mostrando la lista de pasos y la salida del comando </w:t>
+      </w:r>
+      <w:proofErr w:type="spellStart"/>
+      <w:r>
+        <w:t>ls</w:t>
+      </w:r>
+      <w:proofErr w:type="spellEnd"/>
+      <w:r>
+        <w:t xml:space="preserve"> -la dentro del runner.</w:t>
+      </w:r>
+    </w:p>
+    <w:tbl>
+      <w:tblPr>
+        <w:tblW w:w="9746" w:type="dxa"/>
+        <w:tblBorders>
+          <w:top w:val="dashed" w:sz="4" w:space="0" w:color="D6DEE5"/>
+          <w:left w:val="dashed" w:sz="4" w:space="0" w:color="D6DEE5"/>
+          <w:bottom w:val="dashed" w:sz="4" w:space="0" w:color="D6DEE5"/>
+          <w:right w:val="dashed" w:sz="4" w:space="0" w:color="D6DEE5"/>
+          <w:insideH w:val="single" w:sz="4" w:space="0" w:color="auto"/>
+          <w:insideV w:val="single" w:sz="4" w:space="0" w:color="auto"/>
+        </w:tblBorders>
+        <w:tblCellMar>
+          <w:left w:w="10" w:type="dxa"/>
+          <w:right w:w="10" w:type="dxa"/>
+        </w:tblCellMar>
+        <w:tblLook w:val="04A0" w:firstRow="1" w:lastRow="0" w:firstColumn="1" w:lastColumn="0" w:noHBand="0" w:noVBand="1"/>
+      </w:tblPr>
+      <w:tblGrid>
+        <w:gridCol w:w="9950"/>
+      </w:tblGrid>
+      <w:tr>
+        <w:trPr>
+          <w:trHeight w:val="2100"/>
+        </w:trPr>
+        <w:tc>
+          <w:tcPr>
+            <w:tcW w:w="9746" w:type="dxa"/>
+            <w:tcMar>
+              <w:top w:w="60" w:type="dxa"/>
+              <w:left w:w="100" w:type="dxa"/>
+              <w:bottom w:w="60" w:type="dxa"/>
+              <w:right w:w="100" w:type="dxa"/>
+            </w:tcMar>
+            <w:vAlign w:val="center"/>
+          </w:tcPr>
+          <w:p>
+            <w:pPr>
+              <w:spacing w:before="800" w:after="800"/>
+              <w:jc w:val="center"/>
+            </w:pPr>
+            <w:r>
+              <w:rPr>
+                <w:i/>
+                <w:iCs/>
+                <w:color w:val="8F9EAA"/>
+              </w:rPr>
+              <w:lastRenderedPageBreak/>
+              <w:drawing>
+                <wp:inline distT="0" distB="0" distL="0" distR="0" wp14:anchorId="22F459BD" wp14:editId="13236EC5">
+                  <wp:extent cx="6188710" cy="3189605"/>
+                  <wp:effectExtent l="0" t="0" r="2540" b="0"/>
+                  <wp:docPr id="491213703" name="Imagen 1"/>
+                  <wp:cNvGraphicFramePr>
+                    <a:graphicFrameLocks xmlns:a="http://schemas.openxmlformats.org/drawingml/2006/main" noChangeAspect="1"/>
+                  </wp:cNvGraphicFramePr>
+                  <a:graphic xmlns:a="http://schemas.openxmlformats.org/drawingml/2006/main">
+                    <a:graphicData uri="http://schemas.openxmlformats.org/drawingml/2006/picture">
+                      <pic:pic xmlns:pic="http://schemas.openxmlformats.org/drawingml/2006/picture">
+                        <pic:nvPicPr>
+                          <pic:cNvPr id="491213703" name=""/>
+                          <pic:cNvPicPr/>
+                        </pic:nvPicPr>
+                        <pic:blipFill>
+                          <a:blip r:embed="rId11"/>
+                          <a:stretch>
+                            <a:fillRect/>
+                          </a:stretch>
+                        </pic:blipFill>
+                        <pic:spPr>
+                          <a:xfrm>
+                            <a:off x="0" y="0"/>
+                            <a:ext cx="6188710" cy="3189605"/>
+                          </a:xfrm>
+                          <a:prstGeom prst="rect">
+                            <a:avLst/>
+                          </a:prstGeom>
+                        </pic:spPr>
+                      </pic:pic>
+                    </a:graphicData>
+                  </a:graphic>
+                </wp:inline>
+              </w:drawing>
+            </w:r>
+          </w:p>
+        </w:tc>
+      </w:tr>
+    </w:tbl>
+    <w:p>
+      <w:pPr>
+        <w:spacing w:after="160"/>
+      </w:pPr>
+    </w:p>
+    <w:p>
+      <w:pPr>
+        <w:spacing w:after="80" w:line="260" w:lineRule="auto"/>
+        <w:jc w:val="both"/>
+      </w:pPr>
+      <w:proofErr w:type="gramStart"/>
+      <w:r>
+        <w:rPr>
+          <w:b/>
+          <w:bCs/>
+          <w:color w:val="0F3D5C"/>
+        </w:rPr>
+        <w:t>Pregunta N.º</w:t>
+      </w:r>
+      <w:proofErr w:type="gramEnd"/>
+      <w:r>
+        <w:rPr>
+          <w:b/>
+          <w:bCs/>
+          <w:color w:val="0F3D5C"/>
+        </w:rPr>
+        <w:t xml:space="preserve"> 2. </w:t>
+      </w:r>
+      <w:r>
+        <w:rPr>
+          <w:b/>
+          <w:bCs/>
+        </w:rPr>
+        <w:t xml:space="preserve">En la salida de </w:t>
+      </w:r>
+      <w:proofErr w:type="spellStart"/>
+      <w:r>
+        <w:rPr>
+          <w:b/>
+          <w:bCs/>
+        </w:rPr>
+        <w:t>ls</w:t>
+      </w:r>
+      <w:proofErr w:type="spellEnd"/>
+      <w:r>
+        <w:rPr>
+          <w:b/>
+          <w:bCs/>
+        </w:rPr>
+        <w:t xml:space="preserve"> -la aparecen los archivos de su repositorio, pero la máquina que los muestra no es la suya. Describa, con lo que ve en el registro, de dónde salió esa máquina y qué pasa con ella cuando el </w:t>
+      </w:r>
+      <w:proofErr w:type="spellStart"/>
+      <w:r>
+        <w:rPr>
+          <w:b/>
+          <w:bCs/>
+        </w:rPr>
+        <w:t>job</w:t>
+      </w:r>
+      <w:proofErr w:type="spellEnd"/>
+      <w:r>
+        <w:rPr>
+          <w:b/>
+          <w:bCs/>
+        </w:rPr>
+        <w:t xml:space="preserve"> termina.</w:t>
+      </w:r>
+    </w:p>
+    <w:tbl>
+      <w:tblPr>
+        <w:tblW w:w="9746" w:type="dxa"/>
+        <w:tblBorders>
+          <w:top w:val="single" w:sz="4" w:space="0" w:color="D6DEE5"/>
+          <w:left w:val="single" w:sz="4" w:space="0" w:color="D6DEE5"/>
+          <w:bottom w:val="single" w:sz="4" w:space="0" w:color="D6DEE5"/>
+          <w:right w:val="single" w:sz="4" w:space="0" w:color="D6DEE5"/>
+          <w:insideH w:val="single" w:sz="4" w:space="0" w:color="auto"/>
+          <w:insideV w:val="single" w:sz="4" w:space="0" w:color="auto"/>
+        </w:tblBorders>
+        <w:tblCellMar>
+          <w:left w:w="10" w:type="dxa"/>
+          <w:right w:w="10" w:type="dxa"/>
+        </w:tblCellMar>
+        <w:tblLook w:val="04A0" w:firstRow="1" w:lastRow="0" w:firstColumn="1" w:lastColumn="0" w:noHBand="0" w:noVBand="1"/>
+      </w:tblPr>
+      <w:tblGrid>
+        <w:gridCol w:w="9746"/>
+      </w:tblGrid>
+      <w:tr>
+        <w:trPr>
+          <w:trHeight w:val="1400"/>
+        </w:trPr>
+        <w:tc>
+          <w:tcPr>
+            <w:tcW w:w="9746" w:type="dxa"/>
+            <w:tcMar>
+              <w:top w:w="60" w:type="dxa"/>
+              <w:left w:w="100" w:type="dxa"/>
+              <w:bottom w:w="60" w:type="dxa"/>
+              <w:right w:w="100" w:type="dxa"/>
+            </w:tcMar>
+            <w:vAlign w:val="center"/>
+          </w:tcPr>
+          <w:p>
+            <w:r>
+              <w:t>La máquina es un runner de GitHub (</w:t>
+            </w:r>
+            <w:proofErr w:type="spellStart"/>
+            <w:r>
+              <w:t>ubuntu-latest</w:t>
+            </w:r>
+            <w:proofErr w:type="spellEnd"/>
+            <w:r>
+              <w:t xml:space="preserve">), una máquina virtual que GitHub crea automáticamente en la nube cuando se dispara el </w:t>
+            </w:r>
+            <w:proofErr w:type="spellStart"/>
+            <w:r>
+              <w:t>workflow</w:t>
+            </w:r>
+            <w:proofErr w:type="spellEnd"/>
+            <w:r>
+              <w:t xml:space="preserve">. No es mi computadora. Al terminar el </w:t>
+            </w:r>
+            <w:proofErr w:type="spellStart"/>
+            <w:r>
+              <w:t>job</w:t>
+            </w:r>
+            <w:proofErr w:type="spellEnd"/>
+            <w:r>
+              <w:t xml:space="preserve">, esa máquina se destruye por completo (es efímera), por eso cada corrida empieza limpia y necesita </w:t>
+            </w:r>
+            <w:proofErr w:type="spellStart"/>
+            <w:r>
+              <w:t>actions</w:t>
+            </w:r>
+            <w:proofErr w:type="spellEnd"/>
+            <w:r>
+              <w:t>/</w:t>
+            </w:r>
+            <w:proofErr w:type="spellStart"/>
+            <w:r>
+              <w:t>checkout</w:t>
+            </w:r>
+            <w:proofErr w:type="spellEnd"/>
+            <w:r>
+              <w:t xml:space="preserve"> para clonar el repo.</w:t>
+            </w:r>
+          </w:p>
+        </w:tc>
+      </w:tr>
+    </w:tbl>
+    <w:p>
+      <w:pPr>
+        <w:spacing w:after="160"/>
+      </w:pPr>
+    </w:p>
+    <w:p>
+      <w:pPr>
+        <w:pBdr>
+          <w:bottom w:val="single" w:sz="6" w:space="3" w:color="D6DEE5"/>
+        </w:pBdr>
+        <w:spacing w:before="300" w:after="120"/>
+      </w:pPr>
+      <w:r>
+        <w:rPr>
+          <w:b/>
+          <w:bCs/>
+          <w:color w:val="0F3D5C"/>
+          <w:sz w:val="24"/>
+          <w:szCs w:val="24"/>
+        </w:rPr>
+        <w:t>Laboratorio 2 — Ejecutar la suite de pruebas en el runner</w:t>
+      </w:r>
+    </w:p>
+    <w:p>
+      <w:pPr>
+        <w:spacing w:after="80" w:line="260" w:lineRule="auto"/>
+        <w:jc w:val="both"/>
+      </w:pPr>
+      <w:r>
+        <w:rPr>
+          <w:b/>
+          <w:bCs/>
+          <w:color w:val="D97A2B"/>
+        </w:rPr>
+        <w:t xml:space="preserve">Captura N.º 5: </w:t>
+      </w:r>
+      <w:r>
+        <w:t>registro del paso «Ejecutar la suite de la Práctica 7» mostrando el resumen de Jest con las pruebas en verde dentro del runner.</w:t>
+      </w:r>
+    </w:p>
+    <w:tbl>
+      <w:tblPr>
+        <w:tblW w:w="9746" w:type="dxa"/>
+        <w:tblBorders>
+          <w:top w:val="dashed" w:sz="4" w:space="0" w:color="D6DEE5"/>
+          <w:left w:val="dashed" w:sz="4" w:space="0" w:color="D6DEE5"/>
+          <w:bottom w:val="dashed" w:sz="4" w:space="0" w:color="D6DEE5"/>
+          <w:right w:val="dashed" w:sz="4" w:space="0" w:color="D6DEE5"/>
+          <w:insideH w:val="single" w:sz="4" w:space="0" w:color="auto"/>
+          <w:insideV w:val="single" w:sz="4" w:space="0" w:color="auto"/>
+        </w:tblBorders>
+        <w:tblCellMar>
+          <w:left w:w="10" w:type="dxa"/>
+          <w:right w:w="10" w:type="dxa"/>
+        </w:tblCellMar>
+        <w:tblLook w:val="04A0" w:firstRow="1" w:lastRow="0" w:firstColumn="1" w:lastColumn="0" w:noHBand="0" w:noVBand="1"/>
+      </w:tblPr>
+      <w:tblGrid>
+        <w:gridCol w:w="9950"/>
+      </w:tblGrid>
+      <w:tr>
+        <w:trPr>
+          <w:trHeight w:val="2100"/>
+        </w:trPr>
+        <w:tc>
+          <w:tcPr>
+            <w:tcW w:w="9746" w:type="dxa"/>
+            <w:tcMar>
+              <w:top w:w="60" w:type="dxa"/>
+              <w:left w:w="100" w:type="dxa"/>
+              <w:bottom w:w="60" w:type="dxa"/>
+              <w:right w:w="100" w:type="dxa"/>
+            </w:tcMar>
+            <w:vAlign w:val="center"/>
+          </w:tcPr>
+          <w:p>
+            <w:pPr>
+              <w:spacing w:before="800" w:after="800"/>
+              <w:jc w:val="center"/>
+            </w:pPr>
+            <w:r>
+              <w:rPr>
+                <w:i/>
+                <w:iCs/>
+                <w:color w:val="8F9EAA"/>
+              </w:rPr>
+              <w:lastRenderedPageBreak/>
+              <w:drawing>
+                <wp:inline distT="0" distB="0" distL="0" distR="0" wp14:anchorId="1089B74B" wp14:editId="0E497F22">
+                  <wp:extent cx="6188710" cy="3267710"/>
+                  <wp:effectExtent l="0" t="0" r="2540" b="8890"/>
+                  <wp:docPr id="477074935" name="Imagen 1"/>
+                  <wp:cNvGraphicFramePr>
+                    <a:graphicFrameLocks xmlns:a="http://schemas.openxmlformats.org/drawingml/2006/main" noChangeAspect="1"/>
+                  </wp:cNvGraphicFramePr>
+                  <a:graphic xmlns:a="http://schemas.openxmlformats.org/drawingml/2006/main">
+                    <a:graphicData uri="http://schemas.openxmlformats.org/drawingml/2006/picture">
+                      <pic:pic xmlns:pic="http://schemas.openxmlformats.org/drawingml/2006/picture">
+                        <pic:nvPicPr>
+                          <pic:cNvPr id="477074935" name=""/>
+                          <pic:cNvPicPr/>
+                        </pic:nvPicPr>
+                        <pic:blipFill>
+                          <a:blip r:embed="rId12"/>
+                          <a:stretch>
+                            <a:fillRect/>
+                          </a:stretch>
+                        </pic:blipFill>
+                        <pic:spPr>
+                          <a:xfrm>
+                            <a:off x="0" y="0"/>
+                            <a:ext cx="6188710" cy="3267710"/>
+                          </a:xfrm>
+                          <a:prstGeom prst="rect">
+                            <a:avLst/>
+                          </a:prstGeom>
+                        </pic:spPr>
+                      </pic:pic>
+                    </a:graphicData>
+                  </a:graphic>
+                </wp:inline>
+              </w:drawing>
+            </w:r>
+          </w:p>
+        </w:tc>
+      </w:tr>
+    </w:tbl>
+    <w:p>
+      <w:pPr>
+        <w:spacing w:after="160"/>
+      </w:pPr>
+    </w:p>
+    <w:p>
+      <w:pPr>
+        <w:spacing w:after="80" w:line="260" w:lineRule="auto"/>
+        <w:jc w:val="both"/>
+      </w:pPr>
+      <w:r>
+        <w:rPr>
+          <w:b/>
+          <w:bCs/>
+          <w:color w:val="D97A2B"/>
+        </w:rPr>
+        <w:t xml:space="preserve">Captura N.º 6: </w:t>
+      </w:r>
+      <w:r>
+        <w:t>los tiempos del paso de instalación en dos corridas: la anterior sin caché y la posterior con caché, con la diferencia visible.</w:t>
+      </w:r>
+    </w:p>
+    <w:tbl>
+      <w:tblPr>
+        <w:tblW w:w="9746" w:type="dxa"/>
+        <w:tblBorders>
+          <w:top w:val="dashed" w:sz="4" w:space="0" w:color="D6DEE5"/>
+          <w:left w:val="dashed" w:sz="4" w:space="0" w:color="D6DEE5"/>
+          <w:bottom w:val="dashed" w:sz="4" w:space="0" w:color="D6DEE5"/>
+          <w:right w:val="dashed" w:sz="4" w:space="0" w:color="D6DEE5"/>
+          <w:insideH w:val="single" w:sz="4" w:space="0" w:color="auto"/>
+          <w:insideV w:val="single" w:sz="4" w:space="0" w:color="auto"/>
+        </w:tblBorders>
+        <w:tblCellMar>
+          <w:left w:w="10" w:type="dxa"/>
+          <w:right w:w="10" w:type="dxa"/>
+        </w:tblCellMar>
+        <w:tblLook w:val="04A0" w:firstRow="1" w:lastRow="0" w:firstColumn="1" w:lastColumn="0" w:noHBand="0" w:noVBand="1"/>
+      </w:tblPr>
+      <w:tblGrid>
+        <w:gridCol w:w="9950"/>
+      </w:tblGrid>
+      <w:tr>
+        <w:trPr>
+          <w:trHeight w:val="2100"/>
+        </w:trPr>
+        <w:tc>
+          <w:tcPr>
+            <w:tcW w:w="9746" w:type="dxa"/>
+            <w:tcMar>
+              <w:top w:w="60" w:type="dxa"/>
+              <w:left w:w="100" w:type="dxa"/>
+              <w:bottom w:w="60" w:type="dxa"/>
+              <w:right w:w="100" w:type="dxa"/>
+            </w:tcMar>
+            <w:vAlign w:val="center"/>
+          </w:tcPr>
+          <w:p>
+            <w:pPr>
+              <w:spacing w:before="800" w:after="800"/>
+              <w:jc w:val="center"/>
+            </w:pPr>
+            <w:r>
+              <w:lastRenderedPageBreak/>
+              <w:drawing>
+                <wp:inline distT="0" distB="0" distL="0" distR="0" wp14:anchorId="642DCDA2" wp14:editId="4C36AEE5">
+                  <wp:extent cx="6188710" cy="3082290"/>
+                  <wp:effectExtent l="0" t="0" r="2540" b="3810"/>
+                  <wp:docPr id="1984596398" name="Imagen 1"/>
+                  <wp:cNvGraphicFramePr>
+                    <a:graphicFrameLocks xmlns:a="http://schemas.openxmlformats.org/drawingml/2006/main" noChangeAspect="1"/>
+                  </wp:cNvGraphicFramePr>
+                  <a:graphic xmlns:a="http://schemas.openxmlformats.org/drawingml/2006/main">
+                    <a:graphicData uri="http://schemas.openxmlformats.org/drawingml/2006/picture">
+                      <pic:pic xmlns:pic="http://schemas.openxmlformats.org/drawingml/2006/picture">
+                        <pic:nvPicPr>
+                          <pic:cNvPr id="1984596398" name=""/>
+                          <pic:cNvPicPr/>
+                        </pic:nvPicPr>
+                        <pic:blipFill>
+                          <a:blip r:embed="rId13"/>
+                          <a:stretch>
+                            <a:fillRect/>
+                          </a:stretch>
+                        </pic:blipFill>
+                        <pic:spPr>
+                          <a:xfrm>
+                            <a:off x="0" y="0"/>
+                            <a:ext cx="6188710" cy="3082290"/>
+                          </a:xfrm>
+                          <a:prstGeom prst="rect">
+                            <a:avLst/>
+                          </a:prstGeom>
+                        </pic:spPr>
+                      </pic:pic>
+                    </a:graphicData>
+                  </a:graphic>
+                </wp:inline>
+              </w:drawing>
+            </w:r>
+          </w:p>
+        </w:tc>
+      </w:tr>
+    </w:tbl>
+    <w:p>
+      <w:pPr>
+        <w:spacing w:after="160"/>
+      </w:pPr>
+    </w:p>
+    <w:p>
+      <w:pPr>
+        <w:spacing w:after="80" w:line="260" w:lineRule="auto"/>
+        <w:jc w:val="both"/>
+      </w:pPr>
+      <w:proofErr w:type="gramStart"/>
+      <w:r>
+        <w:rPr>
+          <w:b/>
+          <w:bCs/>
+          <w:color w:val="0F3D5C"/>
+        </w:rPr>
+        <w:t>Pregunta N.º</w:t>
+      </w:r>
+      <w:proofErr w:type="gramEnd"/>
+      <w:r>
+        <w:rPr>
+          <w:b/>
+          <w:bCs/>
+          <w:color w:val="0F3D5C"/>
+        </w:rPr>
+        <w:t xml:space="preserve"> 3. </w:t>
+      </w:r>
+      <w:r>
+        <w:rPr>
+          <w:b/>
+          <w:bCs/>
+        </w:rPr>
+        <w:t>El caché guarda las dependencias descargadas entre corridas, pero el runner sigue siendo una máquina nueva cada vez. ¿Qué se conserva exactamente y por qué no se conserva todo el espacio de trabajo?</w:t>
+      </w:r>
+    </w:p>
+    <w:tbl>
+      <w:tblPr>
+        <w:tblW w:w="9746" w:type="dxa"/>
+        <w:tblBorders>
+          <w:top w:val="single" w:sz="4" w:space="0" w:color="D6DEE5"/>
+          <w:left w:val="single" w:sz="4" w:space="0" w:color="D6DEE5"/>
+          <w:bottom w:val="single" w:sz="4" w:space="0" w:color="D6DEE5"/>
+          <w:right w:val="single" w:sz="4" w:space="0" w:color="D6DEE5"/>
+          <w:insideH w:val="single" w:sz="4" w:space="0" w:color="auto"/>
+          <w:insideV w:val="single" w:sz="4" w:space="0" w:color="auto"/>
+        </w:tblBorders>
+        <w:tblCellMar>
+          <w:left w:w="10" w:type="dxa"/>
+          <w:right w:w="10" w:type="dxa"/>
+        </w:tblCellMar>
+        <w:tblLook w:val="04A0" w:firstRow="1" w:lastRow="0" w:firstColumn="1" w:lastColumn="0" w:noHBand="0" w:noVBand="1"/>
+      </w:tblPr>
+      <w:tblGrid>
+        <w:gridCol w:w="9746"/>
+      </w:tblGrid>
+      <w:tr>
+        <w:trPr>
+          <w:trHeight w:val="1400"/>
+        </w:trPr>
+        <w:tc>
+          <w:tcPr>
+            <w:tcW w:w="9746" w:type="dxa"/>
+            <w:tcMar>
+              <w:top w:w="60" w:type="dxa"/>
+              <w:left w:w="100" w:type="dxa"/>
+              <w:bottom w:w="60" w:type="dxa"/>
+              <w:right w:w="100" w:type="dxa"/>
+            </w:tcMar>
+            <w:vAlign w:val="center"/>
+          </w:tcPr>
+          <w:p>
+            <w:r>
+              <w:t>El caché conserva solo las dependencias descargadas (</w:t>
+            </w:r>
+            <w:proofErr w:type="spellStart"/>
+            <w:r>
+              <w:t>node_modules</w:t>
+            </w:r>
+            <w:proofErr w:type="spellEnd"/>
+            <w:r>
+              <w:t xml:space="preserve"> / caché de </w:t>
+            </w:r>
+            <w:proofErr w:type="spellStart"/>
+            <w:r>
+              <w:t>npm</w:t>
+            </w:r>
+            <w:proofErr w:type="spellEnd"/>
+            <w:r>
+              <w:t>) entre corridas, no todo el espacio de trabajo. No se conserva todo porque el runner sigue siendo efímero: cada corrida corre en una máquina virtual nueva que se destruye al terminar. El caché se guarda aparte (en el almacenamiento de GitHub) y se restaura al inicio de la siguiente corrida que use la misma clave. Todo lo demás (archivos generados, resultados, código) sí se pierde si no se declara como artefacto.</w:t>
+            </w:r>
+          </w:p>
+        </w:tc>
+      </w:tr>
+    </w:tbl>
+    <w:p>
+      <w:pPr>
+        <w:spacing w:after="160"/>
+      </w:pPr>
+    </w:p>
+    <w:p>
+      <w:pPr>
+        <w:spacing w:after="80" w:line="260" w:lineRule="auto"/>
+        <w:jc w:val="both"/>
+      </w:pPr>
+      <w:r>
+        <w:rPr>
+          <w:b/>
+          <w:bCs/>
+          <w:color w:val="D97A2B"/>
+        </w:rPr>
+        <w:t xml:space="preserve">Captura N.º 7: </w:t>
+      </w:r>
+      <w:r>
+        <w:t xml:space="preserve">página de resumen de la corrida con la sección </w:t>
+      </w:r>
+      <w:proofErr w:type="spellStart"/>
+      <w:r>
+        <w:t>Artifacts</w:t>
+      </w:r>
+      <w:proofErr w:type="spellEnd"/>
+      <w:r>
+        <w:t xml:space="preserve"> y el archivo de cobertura disponible para descargar.</w:t>
+      </w:r>
+    </w:p>
+    <w:tbl>
+      <w:tblPr>
+        <w:tblW w:w="9746" w:type="dxa"/>
+        <w:tblBorders>
+          <w:top w:val="dashed" w:sz="4" w:space="0" w:color="D6DEE5"/>
+          <w:left w:val="dashed" w:sz="4" w:space="0" w:color="D6DEE5"/>
+          <w:bottom w:val="dashed" w:sz="4" w:space="0" w:color="D6DEE5"/>
+          <w:right w:val="dashed" w:sz="4" w:space="0" w:color="D6DEE5"/>
+          <w:insideH w:val="single" w:sz="4" w:space="0" w:color="auto"/>
+          <w:insideV w:val="single" w:sz="4" w:space="0" w:color="auto"/>
+        </w:tblBorders>
+        <w:tblCellMar>
+          <w:left w:w="10" w:type="dxa"/>
+          <w:right w:w="10" w:type="dxa"/>
+        </w:tblCellMar>
+        <w:tblLook w:val="04A0" w:firstRow="1" w:lastRow="0" w:firstColumn="1" w:lastColumn="0" w:noHBand="0" w:noVBand="1"/>
+      </w:tblPr>
+      <w:tblGrid>
+        <w:gridCol w:w="9950"/>
+      </w:tblGrid>
+      <w:tr>
+        <w:trPr>
+          <w:trHeight w:val="2100"/>
+        </w:trPr>
+        <w:tc>
+          <w:tcPr>
+            <w:tcW w:w="9746" w:type="dxa"/>
+            <w:tcMar>
+              <w:top w:w="60" w:type="dxa"/>
+              <w:left w:w="100" w:type="dxa"/>
+              <w:bottom w:w="60" w:type="dxa"/>
+              <w:right w:w="100" w:type="dxa"/>
+            </w:tcMar>
+            <w:vAlign w:val="center"/>
+          </w:tcPr>
+          <w:p>
+            <w:pPr>
+              <w:spacing w:before="800" w:after="800"/>
+              <w:jc w:val="center"/>
+            </w:pPr>
+            <w:r>
+              <w:rPr>
+                <w:i/>
+                <w:iCs/>
+                <w:color w:val="8F9EAA"/>
+              </w:rPr>
+              <w:lastRenderedPageBreak/>
+              <w:drawing>
+                <wp:inline distT="0" distB="0" distL="0" distR="0" wp14:anchorId="367A11EC" wp14:editId="040E69F9">
+                  <wp:extent cx="6188710" cy="3014980"/>
+                  <wp:effectExtent l="0" t="0" r="2540" b="0"/>
+                  <wp:docPr id="86035311" name="Imagen 1"/>
+                  <wp:cNvGraphicFramePr>
+                    <a:graphicFrameLocks xmlns:a="http://schemas.openxmlformats.org/drawingml/2006/main" noChangeAspect="1"/>
+                  </wp:cNvGraphicFramePr>
+                  <a:graphic xmlns:a="http://schemas.openxmlformats.org/drawingml/2006/main">
+                    <a:graphicData uri="http://schemas.openxmlformats.org/drawingml/2006/picture">
+                      <pic:pic xmlns:pic="http://schemas.openxmlformats.org/drawingml/2006/picture">
+                        <pic:nvPicPr>
+                          <pic:cNvPr id="86035311" name=""/>
+                          <pic:cNvPicPr/>
+                        </pic:nvPicPr>
+                        <pic:blipFill>
+                          <a:blip r:embed="rId14"/>
+                          <a:stretch>
+                            <a:fillRect/>
+                          </a:stretch>
+                        </pic:blipFill>
+                        <pic:spPr>
+                          <a:xfrm>
+                            <a:off x="0" y="0"/>
+                            <a:ext cx="6188710" cy="3014980"/>
+                          </a:xfrm>
+                          <a:prstGeom prst="rect">
+                            <a:avLst/>
+                          </a:prstGeom>
+                        </pic:spPr>
+                      </pic:pic>
+                    </a:graphicData>
+                  </a:graphic>
+                </wp:inline>
+              </w:drawing>
+            </w:r>
+          </w:p>
+        </w:tc>
+      </w:tr>
+    </w:tbl>
+    <w:p>
+      <w:pPr>
+        <w:spacing w:after="160"/>
+      </w:pPr>
+    </w:p>
+    <w:p>
+      <w:pPr>
+        <w:pBdr>
+          <w:bottom w:val="single" w:sz="6" w:space="3" w:color="D6DEE5"/>
+        </w:pBdr>
+        <w:spacing w:before="300" w:after="120"/>
+      </w:pPr>
+      <w:r>
+        <w:rPr>
+          <w:b/>
+          <w:bCs/>
+          <w:color w:val="0F3D5C"/>
+          <w:sz w:val="24"/>
+          <w:szCs w:val="24"/>
+        </w:rPr>
+        <w:t>Laboratorio 3 — Provocar una falla y leerla como se debe</w:t>
+      </w:r>
+    </w:p>
+    <w:p>
+      <w:pPr>
+        <w:spacing w:after="80" w:line="260" w:lineRule="auto"/>
+        <w:jc w:val="both"/>
+      </w:pPr>
+      <w:r>
+        <w:rPr>
+          <w:b/>
+          <w:bCs/>
+          <w:color w:val="D97A2B"/>
+        </w:rPr>
+        <w:t xml:space="preserve">Captura N.º 8: </w:t>
+      </w:r>
+      <w:r>
+        <w:t xml:space="preserve">pestaña </w:t>
+      </w:r>
+      <w:proofErr w:type="spellStart"/>
+      <w:r>
+        <w:t>Actions</w:t>
+      </w:r>
+      <w:proofErr w:type="spellEnd"/>
+      <w:r>
+        <w:t xml:space="preserve"> con la corrida marcada en rojo y el nombre del </w:t>
+      </w:r>
+      <w:proofErr w:type="spellStart"/>
+      <w:r>
+        <w:t>commit</w:t>
+      </w:r>
+      <w:proofErr w:type="spellEnd"/>
+      <w:r>
+        <w:t xml:space="preserve"> que la provocó.</w:t>
+      </w:r>
+    </w:p>
+    <w:tbl>
+      <w:tblPr>
+        <w:tblW w:w="9746" w:type="dxa"/>
+        <w:tblBorders>
+          <w:top w:val="dashed" w:sz="4" w:space="0" w:color="D6DEE5"/>
+          <w:left w:val="dashed" w:sz="4" w:space="0" w:color="D6DEE5"/>
+          <w:bottom w:val="dashed" w:sz="4" w:space="0" w:color="D6DEE5"/>
+          <w:right w:val="dashed" w:sz="4" w:space="0" w:color="D6DEE5"/>
+          <w:insideH w:val="single" w:sz="4" w:space="0" w:color="auto"/>
+          <w:insideV w:val="single" w:sz="4" w:space="0" w:color="auto"/>
+        </w:tblBorders>
+        <w:tblCellMar>
+          <w:left w:w="10" w:type="dxa"/>
+          <w:right w:w="10" w:type="dxa"/>
+        </w:tblCellMar>
+        <w:tblLook w:val="04A0" w:firstRow="1" w:lastRow="0" w:firstColumn="1" w:lastColumn="0" w:noHBand="0" w:noVBand="1"/>
+      </w:tblPr>
+      <w:tblGrid>
+        <w:gridCol w:w="9950"/>
+      </w:tblGrid>
+      <w:tr>
+        <w:trPr>
+          <w:trHeight w:val="2100"/>
+        </w:trPr>
+        <w:tc>
+          <w:tcPr>
+            <w:tcW w:w="9746" w:type="dxa"/>
+            <w:tcMar>
+              <w:top w:w="60" w:type="dxa"/>
+              <w:left w:w="100" w:type="dxa"/>
+              <w:bottom w:w="60" w:type="dxa"/>
+              <w:right w:w="100" w:type="dxa"/>
+            </w:tcMar>
+            <w:vAlign w:val="center"/>
+          </w:tcPr>
+          <w:p>
+            <w:pPr>
+              <w:spacing w:before="800" w:after="800"/>
+              <w:jc w:val="center"/>
+            </w:pPr>
+            <w:r>
+              <w:rPr>
+                <w:i/>
+                <w:iCs/>
+                <w:color w:val="8F9EAA"/>
+              </w:rPr>
+              <w:drawing>
+                <wp:inline distT="0" distB="0" distL="0" distR="0" wp14:anchorId="47591ED7" wp14:editId="4101056F">
+                  <wp:extent cx="6188710" cy="2520315"/>
+                  <wp:effectExtent l="0" t="0" r="2540" b="0"/>
+                  <wp:docPr id="2089570902" name="Imagen 1"/>
+                  <wp:cNvGraphicFramePr>
+                    <a:graphicFrameLocks xmlns:a="http://schemas.openxmlformats.org/drawingml/2006/main" noChangeAspect="1"/>
+                  </wp:cNvGraphicFramePr>
+                  <a:graphic xmlns:a="http://schemas.openxmlformats.org/drawingml/2006/main">
+                    <a:graphicData uri="http://schemas.openxmlformats.org/drawingml/2006/picture">
+                      <pic:pic xmlns:pic="http://schemas.openxmlformats.org/drawingml/2006/picture">
+                        <pic:nvPicPr>
+                          <pic:cNvPr id="2089570902" name=""/>
+                          <pic:cNvPicPr/>
+                        </pic:nvPicPr>
+                        <pic:blipFill>
+                          <a:blip r:embed="rId15"/>
+                          <a:stretch>
+                            <a:fillRect/>
+                          </a:stretch>
+                        </pic:blipFill>
+                        <pic:spPr>
+                          <a:xfrm>
+                            <a:off x="0" y="0"/>
+                            <a:ext cx="6188710" cy="2520315"/>
+                          </a:xfrm>
+                          <a:prstGeom prst="rect">
+                            <a:avLst/>
+                          </a:prstGeom>
+                        </pic:spPr>
+                      </pic:pic>
+                    </a:graphicData>
+                  </a:graphic>
+                </wp:inline>
+              </w:drawing>
+            </w:r>
+          </w:p>
+        </w:tc>
+      </w:tr>
+    </w:tbl>
+    <w:p>
+      <w:pPr>
+        <w:spacing w:after="160"/>
+      </w:pPr>
+    </w:p>
+    <w:p>
+      <w:pPr>
+        <w:spacing w:after="80" w:line="260" w:lineRule="auto"/>
+        <w:jc w:val="both"/>
+      </w:pPr>
+      <w:r>
+        <w:rPr>
+          <w:b/>
+          <w:bCs/>
+          <w:color w:val="D97A2B"/>
+        </w:rPr>
+        <w:t xml:space="preserve">Captura N.º 9: </w:t>
+      </w:r>
+      <w:r>
+        <w:t xml:space="preserve">registro del paso fallido con el mensaje de Jest y la línea «Process </w:t>
+      </w:r>
+      <w:proofErr w:type="spellStart"/>
+      <w:r>
+        <w:t>completed</w:t>
+      </w:r>
+      <w:proofErr w:type="spellEnd"/>
+      <w:r>
+        <w:t xml:space="preserve"> </w:t>
+      </w:r>
+      <w:proofErr w:type="spellStart"/>
+      <w:r>
+        <w:t>with</w:t>
+      </w:r>
+      <w:proofErr w:type="spellEnd"/>
+      <w:r>
+        <w:t xml:space="preserve"> </w:t>
+      </w:r>
+      <w:proofErr w:type="spellStart"/>
+      <w:r>
+        <w:t>exit</w:t>
+      </w:r>
+      <w:proofErr w:type="spellEnd"/>
+      <w:r>
+        <w:t xml:space="preserve"> </w:t>
+      </w:r>
+      <w:proofErr w:type="spellStart"/>
+      <w:r>
+        <w:t>code</w:t>
+      </w:r>
+      <w:proofErr w:type="spellEnd"/>
+      <w:r>
+        <w:t xml:space="preserve"> 1».</w:t>
+      </w:r>
+    </w:p>
+    <w:tbl>
+      <w:tblPr>
+        <w:tblW w:w="9746" w:type="dxa"/>
+        <w:tblBorders>
+          <w:top w:val="dashed" w:sz="4" w:space="0" w:color="D6DEE5"/>
+          <w:left w:val="dashed" w:sz="4" w:space="0" w:color="D6DEE5"/>
+          <w:bottom w:val="dashed" w:sz="4" w:space="0" w:color="D6DEE5"/>
+          <w:right w:val="dashed" w:sz="4" w:space="0" w:color="D6DEE5"/>
+          <w:insideH w:val="single" w:sz="4" w:space="0" w:color="auto"/>
+          <w:insideV w:val="single" w:sz="4" w:space="0" w:color="auto"/>
+        </w:tblBorders>
+        <w:tblCellMar>
+          <w:left w:w="10" w:type="dxa"/>
+          <w:right w:w="10" w:type="dxa"/>
+        </w:tblCellMar>
+        <w:tblLook w:val="04A0" w:firstRow="1" w:lastRow="0" w:firstColumn="1" w:lastColumn="0" w:noHBand="0" w:noVBand="1"/>
+      </w:tblPr>
+      <w:tblGrid>
+        <w:gridCol w:w="9950"/>
+      </w:tblGrid>
+      <w:tr>
+        <w:trPr>
+          <w:trHeight w:val="2100"/>
+        </w:trPr>
+        <w:tc>
+          <w:tcPr>
+            <w:tcW w:w="9746" w:type="dxa"/>
+            <w:tcMar>
+              <w:top w:w="60" w:type="dxa"/>
+              <w:left w:w="100" w:type="dxa"/>
+              <w:bottom w:w="60" w:type="dxa"/>
+              <w:right w:w="100" w:type="dxa"/>
+            </w:tcMar>
+            <w:vAlign w:val="center"/>
+          </w:tcPr>
+          <w:p>
+            <w:pPr>
+              <w:spacing w:before="800" w:after="800"/>
+              <w:jc w:val="center"/>
+            </w:pPr>
+            <w:r>
+              <w:rPr>
+                <w:i/>
+                <w:iCs/>
+                <w:color w:val="8F9EAA"/>
+              </w:rPr>
+              <w:lastRenderedPageBreak/>
+              <w:drawing>
+                <wp:inline distT="0" distB="0" distL="0" distR="0" wp14:anchorId="4405A8DF" wp14:editId="282C3999">
+                  <wp:extent cx="6188710" cy="4674235"/>
+                  <wp:effectExtent l="0" t="0" r="2540" b="0"/>
+                  <wp:docPr id="774071354" name="Imagen 1"/>
+                  <wp:cNvGraphicFramePr>
+                    <a:graphicFrameLocks xmlns:a="http://schemas.openxmlformats.org/drawingml/2006/main" noChangeAspect="1"/>
+                  </wp:cNvGraphicFramePr>
+                  <a:graphic xmlns:a="http://schemas.openxmlformats.org/drawingml/2006/main">
+                    <a:graphicData uri="http://schemas.openxmlformats.org/drawingml/2006/picture">
+                      <pic:pic xmlns:pic="http://schemas.openxmlformats.org/drawingml/2006/picture">
+                        <pic:nvPicPr>
+                          <pic:cNvPr id="774071354" name=""/>
+                          <pic:cNvPicPr/>
+                        </pic:nvPicPr>
+                        <pic:blipFill>
+                          <a:blip r:embed="rId16"/>
+                          <a:stretch>
+                            <a:fillRect/>
+                          </a:stretch>
+                        </pic:blipFill>
+                        <pic:spPr>
+                          <a:xfrm>
+                            <a:off x="0" y="0"/>
+                            <a:ext cx="6188710" cy="4674235"/>
+                          </a:xfrm>
+                          <a:prstGeom prst="rect">
+                            <a:avLst/>
+                          </a:prstGeom>
+                        </pic:spPr>
+                      </pic:pic>
+                    </a:graphicData>
+                  </a:graphic>
+                </wp:inline>
+              </w:drawing>
+            </w:r>
+          </w:p>
+        </w:tc>
+      </w:tr>
+    </w:tbl>
+    <w:p>
+      <w:pPr>
+        <w:spacing w:after="160"/>
+      </w:pPr>
+    </w:p>
+    <w:p>
+      <w:pPr>
+        <w:spacing w:after="80" w:line="260" w:lineRule="auto"/>
+        <w:jc w:val="both"/>
+      </w:pPr>
+      <w:proofErr w:type="gramStart"/>
+      <w:r>
+        <w:rPr>
+          <w:b/>
+          <w:bCs/>
+          <w:color w:val="0F3D5C"/>
+        </w:rPr>
+        <w:t>Pregunta N.º</w:t>
+      </w:r>
+      <w:proofErr w:type="gramEnd"/>
+      <w:r>
+        <w:rPr>
+          <w:b/>
+          <w:bCs/>
+          <w:color w:val="0F3D5C"/>
+        </w:rPr>
+        <w:t xml:space="preserve"> 4. </w:t>
+      </w:r>
+      <w:r>
+        <w:rPr>
+          <w:b/>
+          <w:bCs/>
+        </w:rPr>
+        <w:t>El pipeline no entiende de pruebas ni de Jest. ¿Qué dato concreto usa para decidir que el paso falló, y qué relación tiene con el código de salida que midió en la Práctica 7?</w:t>
+      </w:r>
+    </w:p>
+    <w:tbl>
+      <w:tblPr>
+        <w:tblW w:w="9746" w:type="dxa"/>
+        <w:tblBorders>
+          <w:top w:val="single" w:sz="4" w:space="0" w:color="D6DEE5"/>
+          <w:left w:val="single" w:sz="4" w:space="0" w:color="D6DEE5"/>
+          <w:bottom w:val="single" w:sz="4" w:space="0" w:color="D6DEE5"/>
+          <w:right w:val="single" w:sz="4" w:space="0" w:color="D6DEE5"/>
+          <w:insideH w:val="single" w:sz="4" w:space="0" w:color="auto"/>
+          <w:insideV w:val="single" w:sz="4" w:space="0" w:color="auto"/>
+        </w:tblBorders>
+        <w:tblCellMar>
+          <w:left w:w="10" w:type="dxa"/>
+          <w:right w:w="10" w:type="dxa"/>
+        </w:tblCellMar>
+        <w:tblLook w:val="04A0" w:firstRow="1" w:lastRow="0" w:firstColumn="1" w:lastColumn="0" w:noHBand="0" w:noVBand="1"/>
+      </w:tblPr>
+      <w:tblGrid>
+        <w:gridCol w:w="9746"/>
+      </w:tblGrid>
+      <w:tr>
+        <w:trPr>
+          <w:trHeight w:val="1400"/>
+        </w:trPr>
+        <w:tc>
+          <w:tcPr>
+            <w:tcW w:w="9746" w:type="dxa"/>
+            <w:tcMar>
+              <w:top w:w="60" w:type="dxa"/>
+              <w:left w:w="100" w:type="dxa"/>
+              <w:bottom w:w="60" w:type="dxa"/>
+              <w:right w:w="100" w:type="dxa"/>
+            </w:tcMar>
+            <w:vAlign w:val="center"/>
+          </w:tcPr>
+          <w:p>
+            <w:r>
+              <w:t xml:space="preserve">El pipeline no entiende de Jest. Solo mira el código de salida del comando. Si es 0, pasa; si es 1 (o cualquier otro), falla y detiene el </w:t>
+            </w:r>
+            <w:proofErr w:type="spellStart"/>
+            <w:r>
+              <w:t>job</w:t>
+            </w:r>
+            <w:proofErr w:type="spellEnd"/>
+            <w:r>
+              <w:t xml:space="preserve">. En la Práctica 7 ese código se medía con $LASTEXITCODE en la terminal: cuando los </w:t>
+            </w:r>
+            <w:proofErr w:type="spellStart"/>
+            <w:r>
+              <w:t>tests</w:t>
+            </w:r>
+            <w:proofErr w:type="spellEnd"/>
+            <w:r>
+              <w:t xml:space="preserve"> fallan, </w:t>
+            </w:r>
+            <w:proofErr w:type="spellStart"/>
+            <w:r>
+              <w:t>npm</w:t>
+            </w:r>
+            <w:proofErr w:type="spellEnd"/>
+            <w:r>
+              <w:t xml:space="preserve"> test devuelve 1. El </w:t>
+            </w:r>
+            <w:proofErr w:type="spellStart"/>
+            <w:r>
+              <w:t>workflow</w:t>
+            </w:r>
+            <w:proofErr w:type="spellEnd"/>
+            <w:r>
+              <w:t xml:space="preserve"> automatiza exactamente esa misma verificación.</w:t>
+            </w:r>
+          </w:p>
+          <w:p/>
+        </w:tc>
+      </w:tr>
+    </w:tbl>
+    <w:p>
+      <w:pPr>
+        <w:spacing w:after="160"/>
+      </w:pPr>
+    </w:p>
+    <w:p>
+      <w:pPr>
+        <w:spacing w:after="80" w:line="260" w:lineRule="auto"/>
+        <w:jc w:val="both"/>
+      </w:pPr>
+      <w:r>
+        <w:rPr>
+          <w:b/>
+          <w:bCs/>
+          <w:color w:val="D97A2B"/>
+        </w:rPr>
+        <w:t xml:space="preserve">Captura N.º 10: </w:t>
+      </w:r>
+      <w:r>
+        <w:t>historial de corridas de la rama mostrando la corrida en rojo seguida de la corrida en verde.</w:t>
+      </w:r>
+    </w:p>
+    <w:tbl>
+      <w:tblPr>
+        <w:tblW w:w="9746" w:type="dxa"/>
+        <w:tblBorders>
+          <w:top w:val="dashed" w:sz="4" w:space="0" w:color="D6DEE5"/>
+          <w:left w:val="dashed" w:sz="4" w:space="0" w:color="D6DEE5"/>
+          <w:bottom w:val="dashed" w:sz="4" w:space="0" w:color="D6DEE5"/>
+          <w:right w:val="dashed" w:sz="4" w:space="0" w:color="D6DEE5"/>
+          <w:insideH w:val="single" w:sz="4" w:space="0" w:color="auto"/>
+          <w:insideV w:val="single" w:sz="4" w:space="0" w:color="auto"/>
+        </w:tblBorders>
+        <w:tblCellMar>
+          <w:left w:w="10" w:type="dxa"/>
+          <w:right w:w="10" w:type="dxa"/>
+        </w:tblCellMar>
+        <w:tblLook w:val="04A0" w:firstRow="1" w:lastRow="0" w:firstColumn="1" w:lastColumn="0" w:noHBand="0" w:noVBand="1"/>
+      </w:tblPr>
+      <w:tblGrid>
+        <w:gridCol w:w="9950"/>
+      </w:tblGrid>
+      <w:tr>
+        <w:trPr>
+          <w:trHeight w:val="2100"/>
+        </w:trPr>
+        <w:tc>
+          <w:tcPr>
+            <w:tcW w:w="9746" w:type="dxa"/>
+            <w:tcMar>
+              <w:top w:w="60" w:type="dxa"/>
+              <w:left w:w="100" w:type="dxa"/>
+              <w:bottom w:w="60" w:type="dxa"/>
+              <w:right w:w="100" w:type="dxa"/>
+            </w:tcMar>
+            <w:vAlign w:val="center"/>
+          </w:tcPr>
+          <w:p>
+            <w:pPr>
+              <w:spacing w:before="800" w:after="800"/>
+              <w:jc w:val="center"/>
+            </w:pPr>
+            <w:r>
+              <w:rPr>
+                <w:i/>
+                <w:iCs/>
+                <w:color w:val="8F9EAA"/>
+              </w:rPr>
+              <w:lastRenderedPageBreak/>
+              <w:drawing>
+                <wp:inline distT="0" distB="0" distL="0" distR="0" wp14:anchorId="346977B4" wp14:editId="4D22084F">
+                  <wp:extent cx="6188710" cy="3114675"/>
+                  <wp:effectExtent l="0" t="0" r="2540" b="9525"/>
+                  <wp:docPr id="31040896" name="Imagen 1"/>
+                  <wp:cNvGraphicFramePr>
+                    <a:graphicFrameLocks xmlns:a="http://schemas.openxmlformats.org/drawingml/2006/main" noChangeAspect="1"/>
+                  </wp:cNvGraphicFramePr>
+                  <a:graphic xmlns:a="http://schemas.openxmlformats.org/drawingml/2006/main">
+                    <a:graphicData uri="http://schemas.openxmlformats.org/drawingml/2006/picture">
+                      <pic:pic xmlns:pic="http://schemas.openxmlformats.org/drawingml/2006/picture">
+                        <pic:nvPicPr>
+                          <pic:cNvPr id="31040896" name=""/>
+                          <pic:cNvPicPr/>
+                        </pic:nvPicPr>
+                        <pic:blipFill>
+                          <a:blip r:embed="rId17"/>
+                          <a:stretch>
+                            <a:fillRect/>
+                          </a:stretch>
+                        </pic:blipFill>
+                        <pic:spPr>
+                          <a:xfrm>
+                            <a:off x="0" y="0"/>
+                            <a:ext cx="6188710" cy="3114675"/>
+                          </a:xfrm>
+                          <a:prstGeom prst="rect">
+                            <a:avLst/>
+                          </a:prstGeom>
+                        </pic:spPr>
+                      </pic:pic>
+                    </a:graphicData>
+                  </a:graphic>
+                </wp:inline>
+              </w:drawing>
+            </w:r>
+            <w:r>
+              <w:rPr>
+                <w:noProof/>
+              </w:rPr>
+              <w:t xml:space="preserve"> </w:t>
+            </w:r>
+            <w:r>
+              <w:drawing>
+                <wp:inline distT="0" distB="0" distL="0" distR="0" wp14:anchorId="6DE32204" wp14:editId="3D9CF24F">
+                  <wp:extent cx="6188710" cy="3199130"/>
+                  <wp:effectExtent l="0" t="0" r="2540" b="1270"/>
+                  <wp:docPr id="1967127971" name="Imagen 1"/>
+                  <wp:cNvGraphicFramePr>
+                    <a:graphicFrameLocks xmlns:a="http://schemas.openxmlformats.org/drawingml/2006/main" noChangeAspect="1"/>
+                  </wp:cNvGraphicFramePr>
+                  <a:graphic xmlns:a="http://schemas.openxmlformats.org/drawingml/2006/main">
+                    <a:graphicData uri="http://schemas.openxmlformats.org/drawingml/2006/picture">
+                      <pic:pic xmlns:pic="http://schemas.openxmlformats.org/drawingml/2006/picture">
+                        <pic:nvPicPr>
+                          <pic:cNvPr id="1967127971" name=""/>
+                          <pic:cNvPicPr/>
+                        </pic:nvPicPr>
+                        <pic:blipFill>
+                          <a:blip r:embed="rId18"/>
+                          <a:stretch>
+                            <a:fillRect/>
+                          </a:stretch>
+                        </pic:blipFill>
+                        <pic:spPr>
+                          <a:xfrm>
+                            <a:off x="0" y="0"/>
+                            <a:ext cx="6188710" cy="3199130"/>
+                          </a:xfrm>
+                          <a:prstGeom prst="rect">
+                            <a:avLst/>
+                          </a:prstGeom>
+                        </pic:spPr>
+                      </pic:pic>
+                    </a:graphicData>
+                  </a:graphic>
+                </wp:inline>
+              </w:drawing>
+            </w:r>
+          </w:p>
+        </w:tc>
+      </w:tr>
+    </w:tbl>
+    <w:p>
+      <w:pPr>
+        <w:spacing w:after="160"/>
+      </w:pPr>
+    </w:p>
+    <w:p>
+      <w:pPr>
+        <w:pBdr>
+          <w:bottom w:val="single" w:sz="6" w:space="3" w:color="D6DEE5"/>
+        </w:pBdr>
+        <w:spacing w:before="300" w:after="120"/>
+      </w:pPr>
+      <w:r>
+        <w:rPr>
+          <w:b/>
+          <w:bCs/>
+          <w:color w:val="0F3D5C"/>
+          <w:sz w:val="24"/>
+          <w:szCs w:val="24"/>
+        </w:rPr>
+        <w:t>Laboratorio 4 — Puerta de calidad: análisis estático y dependencias</w:t>
+      </w:r>
+    </w:p>
+    <w:p>
+      <w:pPr>
+        <w:spacing w:after="80" w:line="260" w:lineRule="auto"/>
+        <w:jc w:val="both"/>
+      </w:pPr>
+      <w:r>
+        <w:rPr>
+          <w:b/>
+          <w:bCs/>
+          <w:color w:val="D97A2B"/>
+        </w:rPr>
+        <w:t xml:space="preserve">Captura N.º 11: </w:t>
+      </w:r>
+      <w:r>
+        <w:t xml:space="preserve">vista de la corrida con los dos </w:t>
+      </w:r>
+      <w:proofErr w:type="spellStart"/>
+      <w:r>
+        <w:t>jobs</w:t>
+      </w:r>
+      <w:proofErr w:type="spellEnd"/>
+      <w:r>
+        <w:t>, «pruebas» y «calidad», y el detalle de los pasos de análisis y de escaneo.</w:t>
       </w:r>
     </w:p>
     <w:tbl>
@@ -1718,6 +3103,7 @@
                 <w:iCs/>
                 <w:color w:val="8F9EAA"/>
               </w:rPr>
+              <w:lastRenderedPageBreak/>
               <w:t xml:space="preserve">[ Pegue aquí la captura de </w:t>
             </w:r>
             <w:proofErr w:type="gramStart"/>
@@ -1750,10 +3136,7 @@
           <w:bCs/>
           <w:color w:val="D97A2B"/>
         </w:rPr>
-        <w:t xml:space="preserve">Captura N.º 4: </w:t>
-      </w:r>
-      <w:r>
-        <w:t xml:space="preserve">detalle del </w:t>
+        <w:t xml:space="preserve">Captura N.º 12: </w:t>
       </w:r>
       <w:proofErr w:type="spellStart"/>
       <w:r>
@@ -1761,15 +3144,23 @@
       </w:r>
       <w:proofErr w:type="spellEnd"/>
       <w:r>
-        <w:t xml:space="preserve"> desplegado, mostrando la lista de pasos y la salida del comando </w:t>
+        <w:t xml:space="preserve"> «calidad» en rojo con la salida de </w:t>
       </w:r>
       <w:proofErr w:type="spellStart"/>
       <w:r>
-        <w:t>ls</w:t>
+        <w:t>npm</w:t>
       </w:r>
       <w:proofErr w:type="spellEnd"/>
       <w:r>
-        <w:t xml:space="preserve"> -la dentro del runner.</w:t>
+        <w:t xml:space="preserve"> </w:t>
+      </w:r>
+      <w:proofErr w:type="spellStart"/>
+      <w:r>
+        <w:t>audit</w:t>
+      </w:r>
+      <w:proofErr w:type="spellEnd"/>
+      <w:r>
+        <w:t xml:space="preserve"> señalando la vulnerabilidad, y el pipeline detenido.</w:t>
       </w:r>
     </w:p>
     <w:tbl>
@@ -1851,7 +3242,6 @@
           <w:bCs/>
           <w:color w:val="0F3D5C"/>
         </w:rPr>
-        <w:lastRenderedPageBreak/>
         <w:t>Pregunta N.º</w:t>
       </w:r>
       <w:proofErr w:type="gramEnd"/>
@@ -1861,46 +3251,14 @@
           <w:bCs/>
           <w:color w:val="0F3D5C"/>
         </w:rPr>
-        <w:t xml:space="preserve"> 2. </w:t>
-      </w:r>
-      <w:r>
-        <w:rPr>
-          <w:b/>
-          <w:bCs/>
-        </w:rPr>
-        <w:t xml:space="preserve">En la salida de </w:t>
-      </w:r>
-      <w:proofErr w:type="spellStart"/>
-      <w:r>
-        <w:rPr>
-          <w:b/>
-          <w:bCs/>
-        </w:rPr>
-        <w:t>ls</w:t>
-      </w:r>
-      <w:proofErr w:type="spellEnd"/>
-      <w:r>
-        <w:rPr>
-          <w:b/>
-          <w:bCs/>
-        </w:rPr>
-        <w:t xml:space="preserve"> -la aparecen los archivos de su repositorio, pero la máquina que los muestra no es la suya. Describa, con lo que ve en el registro, de dónde salió esa máquina y qué pasa con ella cuando el </w:t>
-      </w:r>
-      <w:proofErr w:type="spellStart"/>
-      <w:r>
-        <w:rPr>
-          <w:b/>
-          <w:bCs/>
-        </w:rPr>
-        <w:t>job</w:t>
-      </w:r>
-      <w:proofErr w:type="spellEnd"/>
-      <w:r>
-        <w:rPr>
-          <w:b/>
-          <w:bCs/>
-        </w:rPr>
-        <w:t xml:space="preserve"> termina.</w:t>
+        <w:t xml:space="preserve"> 5. </w:t>
+      </w:r>
+      <w:r>
+        <w:rPr>
+          <w:b/>
+          <w:bCs/>
+        </w:rPr>
+        <w:t>El análisis estático y el escaneo de dependencias no ejecutan una sola línea de su lógica de negocio. ¿Qué clase de defecto detecta cada uno que la suite de pruebas de la Práctica 7 nunca detectaría?</w:t>
       </w:r>
     </w:p>
     <w:tbl>
@@ -1962,7 +3320,7 @@
           <w:sz w:val="24"/>
           <w:szCs w:val="24"/>
         </w:rPr>
-        <w:t>Laboratorio 2 — Ejecutar la suite de pruebas en el runner</w:t>
+        <w:t>Laboratorio 5 — Construir y publicar la imagen del servicio</w:t>
       </w:r>
     </w:p>
     <w:p>
@@ -1976,10 +3334,10 @@
           <w:bCs/>
           <w:color w:val="D97A2B"/>
         </w:rPr>
-        <w:t xml:space="preserve">Captura N.º 5: </w:t>
-      </w:r>
-      <w:r>
-        <w:t>registro del paso «Ejecutar la suite de la Práctica 7» mostrando el resumen de Jest con las pruebas en verde dentro del runner.</w:t>
+        <w:t xml:space="preserve">Captura N.º 13: </w:t>
+      </w:r>
+      <w:r>
+        <w:t>grafo de la corrida mostrando «pruebas» y «calidad» en paralelo y «imagen» ejecutándose después de ambos.</w:t>
       </w:r>
     </w:p>
     <w:tbl>
@@ -2060,10 +3418,26 @@
           <w:bCs/>
           <w:color w:val="D97A2B"/>
         </w:rPr>
-        <w:t xml:space="preserve">Captura N.º 6: </w:t>
-      </w:r>
-      <w:r>
-        <w:t>los tiempos del paso de instalación en dos corridas: la anterior sin caché y la posterior con caché, con la diferencia visible.</w:t>
+        <w:t xml:space="preserve">Captura N.º 14: </w:t>
+      </w:r>
+      <w:r>
+        <w:t xml:space="preserve">el paquete publicado en GitHub con sus dos etiquetas, y la terminal con el </w:t>
+      </w:r>
+      <w:proofErr w:type="spellStart"/>
+      <w:r>
+        <w:t>docker</w:t>
+      </w:r>
+      <w:proofErr w:type="spellEnd"/>
+      <w:r>
+        <w:t xml:space="preserve"> </w:t>
+      </w:r>
+      <w:proofErr w:type="spellStart"/>
+      <w:r>
+        <w:t>pull</w:t>
+      </w:r>
+      <w:proofErr w:type="spellEnd"/>
+      <w:r>
+        <w:t xml:space="preserve"> y el contenedor ejecutándose.</w:t>
       </w:r>
     </w:p>
     <w:tbl>
@@ -2112,6 +3486,7 @@
                 <w:iCs/>
                 <w:color w:val="8F9EAA"/>
               </w:rPr>
+              <w:lastRenderedPageBreak/>
               <w:t xml:space="preserve">[ Pegue aquí la captura de </w:t>
             </w:r>
             <w:proofErr w:type="gramStart"/>
@@ -2154,14 +3529,46 @@
           <w:bCs/>
           <w:color w:val="0F3D5C"/>
         </w:rPr>
-        <w:t xml:space="preserve"> 3. </w:t>
-      </w:r>
-      <w:r>
-        <w:rPr>
-          <w:b/>
-          <w:bCs/>
-        </w:rPr>
-        <w:t>El caché guarda las dependencias descargadas entre corridas, pero el runner sigue siendo una máquina nueva cada vez. ¿Qué se conserva exactamente y por qué no se conserva todo el espacio de trabajo?</w:t>
+        <w:t xml:space="preserve"> 6. </w:t>
+      </w:r>
+      <w:r>
+        <w:rPr>
+          <w:b/>
+          <w:bCs/>
+        </w:rPr>
+        <w:t xml:space="preserve">La imagen lleva dos etiquetas: el </w:t>
+      </w:r>
+      <w:proofErr w:type="spellStart"/>
+      <w:r>
+        <w:rPr>
+          <w:b/>
+          <w:bCs/>
+        </w:rPr>
+        <w:t>sha</w:t>
+      </w:r>
+      <w:proofErr w:type="spellEnd"/>
+      <w:r>
+        <w:rPr>
+          <w:b/>
+          <w:bCs/>
+        </w:rPr>
+        <w:t xml:space="preserve"> del </w:t>
+      </w:r>
+      <w:proofErr w:type="spellStart"/>
+      <w:r>
+        <w:rPr>
+          <w:b/>
+          <w:bCs/>
+        </w:rPr>
+        <w:t>commit</w:t>
+      </w:r>
+      <w:proofErr w:type="spellEnd"/>
+      <w:r>
+        <w:rPr>
+          <w:b/>
+          <w:bCs/>
+        </w:rPr>
+        <w:t xml:space="preserve"> y la versión 1.0.0. ¿Para qué sirve cada una y cuál usaría usted para investigar un error reportado en producción hace tres semanas?</w:t>
       </w:r>
     </w:p>
     <w:tbl>
@@ -2210,6 +3617,24 @@
     </w:p>
     <w:p>
       <w:pPr>
+        <w:pBdr>
+          <w:bottom w:val="single" w:sz="6" w:space="3" w:color="D6DEE5"/>
+        </w:pBdr>
+        <w:spacing w:before="300" w:after="120"/>
+      </w:pPr>
+      <w:r>
+        <w:rPr>
+          <w:b/>
+          <w:bCs/>
+          <w:color w:val="0F3D5C"/>
+          <w:sz w:val="24"/>
+          <w:szCs w:val="24"/>
+        </w:rPr>
+        <w:t>Laboratorio 6 — Proteger la rama principal</w:t>
+      </w:r>
+    </w:p>
+    <w:p>
+      <w:pPr>
         <w:spacing w:after="80" w:line="260" w:lineRule="auto"/>
         <w:jc w:val="both"/>
       </w:pPr>
@@ -2219,18 +3644,26 @@
           <w:bCs/>
           <w:color w:val="D97A2B"/>
         </w:rPr>
-        <w:t xml:space="preserve">Captura N.º 7: </w:t>
-      </w:r>
-      <w:r>
-        <w:t xml:space="preserve">página de resumen de la corrida con la sección </w:t>
+        <w:t xml:space="preserve">Captura N.º 15: </w:t>
+      </w:r>
+      <w:r>
+        <w:t xml:space="preserve">pantalla de configuración de la regla de protección de </w:t>
       </w:r>
       <w:proofErr w:type="spellStart"/>
       <w:r>
-        <w:t>Artifacts</w:t>
+        <w:t>main</w:t>
       </w:r>
       <w:proofErr w:type="spellEnd"/>
       <w:r>
-        <w:t xml:space="preserve"> y el archivo de cobertura disponible para descargar.</w:t>
+        <w:t xml:space="preserve"> con las condiciones marcadas y los </w:t>
+      </w:r>
+      <w:proofErr w:type="spellStart"/>
+      <w:r>
+        <w:t>checks</w:t>
+      </w:r>
+      <w:proofErr w:type="spellEnd"/>
+      <w:r>
+        <w:t xml:space="preserve"> obligatorios seleccionados.</w:t>
       </w:r>
     </w:p>
     <w:tbl>
@@ -2279,7 +3712,6 @@
                 <w:iCs/>
                 <w:color w:val="8F9EAA"/>
               </w:rPr>
-              <w:lastRenderedPageBreak/>
               <w:t xml:space="preserve">[ Pegue aquí la captura de </w:t>
             </w:r>
             <w:proofErr w:type="gramStart"/>
@@ -2303,24 +3735,6 @@
     </w:p>
     <w:p>
       <w:pPr>
-        <w:pBdr>
-          <w:bottom w:val="single" w:sz="6" w:space="3" w:color="D6DEE5"/>
-        </w:pBdr>
-        <w:spacing w:before="300" w:after="120"/>
-      </w:pPr>
-      <w:r>
-        <w:rPr>
-          <w:b/>
-          <w:bCs/>
-          <w:color w:val="0F3D5C"/>
-          <w:sz w:val="24"/>
-          <w:szCs w:val="24"/>
-        </w:rPr>
-        <w:t>Laboratorio 3 — Provocar una falla y leerla como se debe</w:t>
-      </w:r>
-    </w:p>
-    <w:p>
-      <w:pPr>
         <w:spacing w:after="80" w:line="260" w:lineRule="auto"/>
         <w:jc w:val="both"/>
       </w:pPr>
@@ -2330,26 +3744,63 @@
           <w:bCs/>
           <w:color w:val="D97A2B"/>
         </w:rPr>
-        <w:t xml:space="preserve">Captura N.º 8: </w:t>
-      </w:r>
-      <w:r>
-        <w:t xml:space="preserve">pestaña </w:t>
+        <w:t xml:space="preserve">Captura N.º 16: </w:t>
       </w:r>
       <w:proofErr w:type="spellStart"/>
       <w:r>
-        <w:t>Actions</w:t>
+        <w:t>pull</w:t>
       </w:r>
       <w:proofErr w:type="spellEnd"/>
       <w:r>
-        <w:t xml:space="preserve"> con la corrida marcada en rojo y el nombre del </w:t>
+        <w:t xml:space="preserve"> </w:t>
       </w:r>
       <w:proofErr w:type="spellStart"/>
       <w:r>
-        <w:t>commit</w:t>
+        <w:t>request</w:t>
       </w:r>
       <w:proofErr w:type="spellEnd"/>
       <w:r>
-        <w:t xml:space="preserve"> que la provocó.</w:t>
+        <w:t xml:space="preserve"> con el </w:t>
+      </w:r>
+      <w:proofErr w:type="spellStart"/>
+      <w:r>
+        <w:t>check</w:t>
+      </w:r>
+      <w:proofErr w:type="spellEnd"/>
+      <w:r>
+        <w:t xml:space="preserve"> en rojo y el botón «</w:t>
+      </w:r>
+      <w:proofErr w:type="spellStart"/>
+      <w:r>
+        <w:t>Merge</w:t>
+      </w:r>
+      <w:proofErr w:type="spellEnd"/>
+      <w:r>
+        <w:t xml:space="preserve"> </w:t>
+      </w:r>
+      <w:proofErr w:type="spellStart"/>
+      <w:r>
+        <w:t>pull</w:t>
+      </w:r>
+      <w:proofErr w:type="spellEnd"/>
+      <w:r>
+        <w:t xml:space="preserve"> </w:t>
+      </w:r>
+      <w:proofErr w:type="spellStart"/>
+      <w:r>
+        <w:t>request</w:t>
+      </w:r>
+      <w:proofErr w:type="spellEnd"/>
+      <w:r>
+        <w:t xml:space="preserve">» bloqueado, con el mensaje de </w:t>
+      </w:r>
+      <w:proofErr w:type="spellStart"/>
+      <w:r>
+        <w:t>checks</w:t>
+      </w:r>
+      <w:proofErr w:type="spellEnd"/>
+      <w:r>
+        <w:t xml:space="preserve"> requeridos.</w:t>
       </w:r>
     </w:p>
     <w:tbl>
@@ -2424,48 +3875,117 @@
         <w:spacing w:after="80" w:line="260" w:lineRule="auto"/>
         <w:jc w:val="both"/>
       </w:pPr>
+      <w:proofErr w:type="gramStart"/>
+      <w:r>
+        <w:rPr>
+          <w:b/>
+          <w:bCs/>
+          <w:color w:val="0F3D5C"/>
+        </w:rPr>
+        <w:t>Pregunta N.º</w:t>
+      </w:r>
+      <w:proofErr w:type="gramEnd"/>
+      <w:r>
+        <w:rPr>
+          <w:b/>
+          <w:bCs/>
+          <w:color w:val="0F3D5C"/>
+        </w:rPr>
+        <w:t xml:space="preserve"> 7. </w:t>
+      </w:r>
+      <w:r>
+        <w:rPr>
+          <w:b/>
+          <w:bCs/>
+        </w:rPr>
+        <w:t>Sin esta regla, el pipeline seguiría detectando el error y marcando el rojo. ¿Qué cambia exactamente al activarla y por qué eso importa más en un equipo de ocho personas que en un proyecto de una sola?</w:t>
+      </w:r>
+    </w:p>
+    <w:tbl>
+      <w:tblPr>
+        <w:tblW w:w="9746" w:type="dxa"/>
+        <w:tblBorders>
+          <w:top w:val="single" w:sz="4" w:space="0" w:color="D6DEE5"/>
+          <w:left w:val="single" w:sz="4" w:space="0" w:color="D6DEE5"/>
+          <w:bottom w:val="single" w:sz="4" w:space="0" w:color="D6DEE5"/>
+          <w:right w:val="single" w:sz="4" w:space="0" w:color="D6DEE5"/>
+          <w:insideH w:val="single" w:sz="4" w:space="0" w:color="auto"/>
+          <w:insideV w:val="single" w:sz="4" w:space="0" w:color="auto"/>
+        </w:tblBorders>
+        <w:tblCellMar>
+          <w:left w:w="10" w:type="dxa"/>
+          <w:right w:w="10" w:type="dxa"/>
+        </w:tblCellMar>
+        <w:tblLook w:val="04A0" w:firstRow="1" w:lastRow="0" w:firstColumn="1" w:lastColumn="0" w:noHBand="0" w:noVBand="1"/>
+      </w:tblPr>
+      <w:tblGrid>
+        <w:gridCol w:w="9746"/>
+      </w:tblGrid>
+      <w:tr>
+        <w:trPr>
+          <w:trHeight w:val="1400"/>
+        </w:trPr>
+        <w:tc>
+          <w:tcPr>
+            <w:tcW w:w="9746" w:type="dxa"/>
+            <w:tcMar>
+              <w:top w:w="60" w:type="dxa"/>
+              <w:left w:w="100" w:type="dxa"/>
+              <w:bottom w:w="60" w:type="dxa"/>
+              <w:right w:w="100" w:type="dxa"/>
+            </w:tcMar>
+            <w:vAlign w:val="center"/>
+          </w:tcPr>
+          <w:p/>
+        </w:tc>
+      </w:tr>
+    </w:tbl>
+    <w:p>
+      <w:pPr>
+        <w:spacing w:after="160"/>
+      </w:pPr>
+    </w:p>
+    <w:p>
+      <w:pPr>
+        <w:pBdr>
+          <w:bottom w:val="single" w:sz="6" w:space="3" w:color="D6DEE5"/>
+        </w:pBdr>
+        <w:spacing w:before="300" w:after="120"/>
+      </w:pPr>
+      <w:r>
+        <w:rPr>
+          <w:b/>
+          <w:bCs/>
+          <w:color w:val="0F3D5C"/>
+          <w:sz w:val="24"/>
+          <w:szCs w:val="24"/>
+        </w:rPr>
+        <w:t>Laboratorio 7 — Acelerar el pipeline y medirlo</w:t>
+      </w:r>
+    </w:p>
+    <w:p>
+      <w:pPr>
+        <w:spacing w:after="80" w:line="260" w:lineRule="auto"/>
+        <w:jc w:val="both"/>
+      </w:pPr>
       <w:r>
         <w:rPr>
           <w:b/>
           <w:bCs/>
           <w:color w:val="D97A2B"/>
         </w:rPr>
-        <w:t xml:space="preserve">Captura N.º 9: </w:t>
-      </w:r>
-      <w:r>
-        <w:t xml:space="preserve">registro del paso fallido con el mensaje de Jest y la línea «Process </w:t>
+        <w:t xml:space="preserve">Captura N.º 17: </w:t>
+      </w:r>
+      <w:r>
+        <w:t xml:space="preserve">corrida con los dos </w:t>
       </w:r>
       <w:proofErr w:type="spellStart"/>
       <w:r>
-        <w:t>completed</w:t>
+        <w:t>jobs</w:t>
       </w:r>
       <w:proofErr w:type="spellEnd"/>
       <w:r>
-        <w:t xml:space="preserve"> </w:t>
-      </w:r>
-      <w:proofErr w:type="spellStart"/>
-      <w:r>
-        <w:t>with</w:t>
-      </w:r>
-      <w:proofErr w:type="spellEnd"/>
-      <w:r>
-        <w:t xml:space="preserve"> </w:t>
-      </w:r>
-      <w:proofErr w:type="spellStart"/>
-      <w:r>
-        <w:t>exit</w:t>
-      </w:r>
-      <w:proofErr w:type="spellEnd"/>
-      <w:r>
-        <w:t xml:space="preserve"> </w:t>
-      </w:r>
-      <w:proofErr w:type="spellStart"/>
-      <w:r>
-        <w:t>code</w:t>
-      </w:r>
-      <w:proofErr w:type="spellEnd"/>
-      <w:r>
-        <w:t xml:space="preserve"> 1».</w:t>
+        <w:t xml:space="preserve"> de la matriz, «pruebas (20)» y «pruebas (22)», ejecutándose en paralelo.</w:t>
       </w:r>
     </w:p>
     <w:tbl>
@@ -2540,6 +4060,90 @@
         <w:spacing w:after="80" w:line="260" w:lineRule="auto"/>
         <w:jc w:val="both"/>
       </w:pPr>
+      <w:r>
+        <w:rPr>
+          <w:b/>
+          <w:bCs/>
+          <w:color w:val="D97A2B"/>
+        </w:rPr>
+        <w:t xml:space="preserve">Captura N.º 18: </w:t>
+      </w:r>
+      <w:r>
+        <w:t>la tabla comparativa de tiempos que usted construyó junto a la captura de la corrida donde se leen las duraciones.</w:t>
+      </w:r>
+    </w:p>
+    <w:tbl>
+      <w:tblPr>
+        <w:tblW w:w="9746" w:type="dxa"/>
+        <w:tblBorders>
+          <w:top w:val="dashed" w:sz="4" w:space="0" w:color="D6DEE5"/>
+          <w:left w:val="dashed" w:sz="4" w:space="0" w:color="D6DEE5"/>
+          <w:bottom w:val="dashed" w:sz="4" w:space="0" w:color="D6DEE5"/>
+          <w:right w:val="dashed" w:sz="4" w:space="0" w:color="D6DEE5"/>
+          <w:insideH w:val="single" w:sz="4" w:space="0" w:color="auto"/>
+          <w:insideV w:val="single" w:sz="4" w:space="0" w:color="auto"/>
+        </w:tblBorders>
+        <w:tblCellMar>
+          <w:left w:w="10" w:type="dxa"/>
+          <w:right w:w="10" w:type="dxa"/>
+        </w:tblCellMar>
+        <w:tblLook w:val="04A0" w:firstRow="1" w:lastRow="0" w:firstColumn="1" w:lastColumn="0" w:noHBand="0" w:noVBand="1"/>
+      </w:tblPr>
+      <w:tblGrid>
+        <w:gridCol w:w="9746"/>
+      </w:tblGrid>
+      <w:tr>
+        <w:trPr>
+          <w:trHeight w:val="2100"/>
+        </w:trPr>
+        <w:tc>
+          <w:tcPr>
+            <w:tcW w:w="9746" w:type="dxa"/>
+            <w:tcMar>
+              <w:top w:w="60" w:type="dxa"/>
+              <w:left w:w="100" w:type="dxa"/>
+              <w:bottom w:w="60" w:type="dxa"/>
+              <w:right w:w="100" w:type="dxa"/>
+            </w:tcMar>
+            <w:vAlign w:val="center"/>
+          </w:tcPr>
+          <w:p>
+            <w:pPr>
+              <w:spacing w:before="800" w:after="800"/>
+              <w:jc w:val="center"/>
+            </w:pPr>
+            <w:r>
+              <w:rPr>
+                <w:i/>
+                <w:iCs/>
+                <w:color w:val="8F9EAA"/>
+              </w:rPr>
+              <w:t xml:space="preserve">[ Pegue aquí la captura de </w:t>
+            </w:r>
+            <w:proofErr w:type="gramStart"/>
+            <w:r>
+              <w:rPr>
+                <w:i/>
+                <w:iCs/>
+                <w:color w:val="8F9EAA"/>
+              </w:rPr>
+              <w:t>pantalla ]</w:t>
+            </w:r>
+            <w:proofErr w:type="gramEnd"/>
+          </w:p>
+        </w:tc>
+      </w:tr>
+    </w:tbl>
+    <w:p>
+      <w:pPr>
+        <w:spacing w:after="160"/>
+      </w:pPr>
+    </w:p>
+    <w:p>
+      <w:pPr>
+        <w:spacing w:after="80" w:line="260" w:lineRule="auto"/>
+        <w:jc w:val="both"/>
+      </w:pPr>
       <w:proofErr w:type="gramStart"/>
       <w:r>
         <w:rPr>
@@ -2556,14 +4160,30 @@
           <w:bCs/>
           <w:color w:val="0F3D5C"/>
         </w:rPr>
-        <w:t xml:space="preserve"> 4. </w:t>
-      </w:r>
-      <w:r>
-        <w:rPr>
-          <w:b/>
-          <w:bCs/>
-        </w:rPr>
-        <w:t>El pipeline no entiende de pruebas ni de Jest. ¿Qué dato concreto usa para decidir que el paso falló, y qué relación tiene con el código de salida que midió en la Práctica 7?</w:t>
+        <w:t xml:space="preserve"> 8. </w:t>
+      </w:r>
+      <w:r>
+        <w:rPr>
+          <w:b/>
+          <w:bCs/>
+        </w:rPr>
+        <w:t xml:space="preserve">Su pipeline tarda hoy cierto número de minutos. Si tardara cuarenta, ¿qué haría el equipo en la práctica y qué consecuencia tendría eso sobre la calidad del código que llega a </w:t>
+      </w:r>
+      <w:proofErr w:type="spellStart"/>
+      <w:r>
+        <w:rPr>
+          <w:b/>
+          <w:bCs/>
+        </w:rPr>
+        <w:t>main</w:t>
+      </w:r>
+      <w:proofErr w:type="spellEnd"/>
+      <w:r>
+        <w:rPr>
+          <w:b/>
+          <w:bCs/>
+        </w:rPr>
+        <w:t>?</w:t>
       </w:r>
     </w:p>
     <w:tbl>
@@ -2612,1307 +4232,6 @@
     </w:p>
     <w:p>
       <w:pPr>
-        <w:spacing w:after="80" w:line="260" w:lineRule="auto"/>
-        <w:jc w:val="both"/>
-      </w:pPr>
-      <w:r>
-        <w:rPr>
-          <w:b/>
-          <w:bCs/>
-          <w:color w:val="D97A2B"/>
-        </w:rPr>
-        <w:t xml:space="preserve">Captura N.º 10: </w:t>
-      </w:r>
-      <w:r>
-        <w:t>historial de corridas de la rama mostrando la corrida en rojo seguida de la corrida en verde.</w:t>
-      </w:r>
-    </w:p>
-    <w:tbl>
-      <w:tblPr>
-        <w:tblW w:w="9746" w:type="dxa"/>
-        <w:tblBorders>
-          <w:top w:val="dashed" w:sz="4" w:space="0" w:color="D6DEE5"/>
-          <w:left w:val="dashed" w:sz="4" w:space="0" w:color="D6DEE5"/>
-          <w:bottom w:val="dashed" w:sz="4" w:space="0" w:color="D6DEE5"/>
-          <w:right w:val="dashed" w:sz="4" w:space="0" w:color="D6DEE5"/>
-          <w:insideH w:val="single" w:sz="4" w:space="0" w:color="auto"/>
-          <w:insideV w:val="single" w:sz="4" w:space="0" w:color="auto"/>
-        </w:tblBorders>
-        <w:tblCellMar>
-          <w:left w:w="10" w:type="dxa"/>
-          <w:right w:w="10" w:type="dxa"/>
-        </w:tblCellMar>
-        <w:tblLook w:val="04A0" w:firstRow="1" w:lastRow="0" w:firstColumn="1" w:lastColumn="0" w:noHBand="0" w:noVBand="1"/>
-      </w:tblPr>
-      <w:tblGrid>
-        <w:gridCol w:w="9746"/>
-      </w:tblGrid>
-      <w:tr>
-        <w:trPr>
-          <w:trHeight w:val="2100"/>
-        </w:trPr>
-        <w:tc>
-          <w:tcPr>
-            <w:tcW w:w="9746" w:type="dxa"/>
-            <w:tcMar>
-              <w:top w:w="60" w:type="dxa"/>
-              <w:left w:w="100" w:type="dxa"/>
-              <w:bottom w:w="60" w:type="dxa"/>
-              <w:right w:w="100" w:type="dxa"/>
-            </w:tcMar>
-            <w:vAlign w:val="center"/>
-          </w:tcPr>
-          <w:p>
-            <w:pPr>
-              <w:spacing w:before="800" w:after="800"/>
-              <w:jc w:val="center"/>
-            </w:pPr>
-            <w:r>
-              <w:rPr>
-                <w:i/>
-                <w:iCs/>
-                <w:color w:val="8F9EAA"/>
-              </w:rPr>
-              <w:lastRenderedPageBreak/>
-              <w:t xml:space="preserve">[ Pegue aquí la captura de </w:t>
-            </w:r>
-            <w:proofErr w:type="gramStart"/>
-            <w:r>
-              <w:rPr>
-                <w:i/>
-                <w:iCs/>
-                <w:color w:val="8F9EAA"/>
-              </w:rPr>
-              <w:t>pantalla ]</w:t>
-            </w:r>
-            <w:proofErr w:type="gramEnd"/>
-          </w:p>
-        </w:tc>
-      </w:tr>
-    </w:tbl>
-    <w:p>
-      <w:pPr>
-        <w:spacing w:after="160"/>
-      </w:pPr>
-    </w:p>
-    <w:p>
-      <w:pPr>
-        <w:pBdr>
-          <w:bottom w:val="single" w:sz="6" w:space="3" w:color="D6DEE5"/>
-        </w:pBdr>
-        <w:spacing w:before="300" w:after="120"/>
-      </w:pPr>
-      <w:r>
-        <w:rPr>
-          <w:b/>
-          <w:bCs/>
-          <w:color w:val="0F3D5C"/>
-          <w:sz w:val="24"/>
-          <w:szCs w:val="24"/>
-        </w:rPr>
-        <w:t>Laboratorio 4 — Puerta de calidad: análisis estático y dependencias</w:t>
-      </w:r>
-    </w:p>
-    <w:p>
-      <w:pPr>
-        <w:spacing w:after="80" w:line="260" w:lineRule="auto"/>
-        <w:jc w:val="both"/>
-      </w:pPr>
-      <w:r>
-        <w:rPr>
-          <w:b/>
-          <w:bCs/>
-          <w:color w:val="D97A2B"/>
-        </w:rPr>
-        <w:t xml:space="preserve">Captura N.º 11: </w:t>
-      </w:r>
-      <w:r>
-        <w:t xml:space="preserve">vista de la corrida con los dos </w:t>
-      </w:r>
-      <w:proofErr w:type="spellStart"/>
-      <w:r>
-        <w:t>jobs</w:t>
-      </w:r>
-      <w:proofErr w:type="spellEnd"/>
-      <w:r>
-        <w:t>, «pruebas» y «calidad», y el detalle de los pasos de análisis y de escaneo.</w:t>
-      </w:r>
-    </w:p>
-    <w:tbl>
-      <w:tblPr>
-        <w:tblW w:w="9746" w:type="dxa"/>
-        <w:tblBorders>
-          <w:top w:val="dashed" w:sz="4" w:space="0" w:color="D6DEE5"/>
-          <w:left w:val="dashed" w:sz="4" w:space="0" w:color="D6DEE5"/>
-          <w:bottom w:val="dashed" w:sz="4" w:space="0" w:color="D6DEE5"/>
-          <w:right w:val="dashed" w:sz="4" w:space="0" w:color="D6DEE5"/>
-          <w:insideH w:val="single" w:sz="4" w:space="0" w:color="auto"/>
-          <w:insideV w:val="single" w:sz="4" w:space="0" w:color="auto"/>
-        </w:tblBorders>
-        <w:tblCellMar>
-          <w:left w:w="10" w:type="dxa"/>
-          <w:right w:w="10" w:type="dxa"/>
-        </w:tblCellMar>
-        <w:tblLook w:val="04A0" w:firstRow="1" w:lastRow="0" w:firstColumn="1" w:lastColumn="0" w:noHBand="0" w:noVBand="1"/>
-      </w:tblPr>
-      <w:tblGrid>
-        <w:gridCol w:w="9746"/>
-      </w:tblGrid>
-      <w:tr>
-        <w:trPr>
-          <w:trHeight w:val="2100"/>
-        </w:trPr>
-        <w:tc>
-          <w:tcPr>
-            <w:tcW w:w="9746" w:type="dxa"/>
-            <w:tcMar>
-              <w:top w:w="60" w:type="dxa"/>
-              <w:left w:w="100" w:type="dxa"/>
-              <w:bottom w:w="60" w:type="dxa"/>
-              <w:right w:w="100" w:type="dxa"/>
-            </w:tcMar>
-            <w:vAlign w:val="center"/>
-          </w:tcPr>
-          <w:p>
-            <w:pPr>
-              <w:spacing w:before="800" w:after="800"/>
-              <w:jc w:val="center"/>
-            </w:pPr>
-            <w:r>
-              <w:rPr>
-                <w:i/>
-                <w:iCs/>
-                <w:color w:val="8F9EAA"/>
-              </w:rPr>
-              <w:t xml:space="preserve">[ Pegue aquí la captura de </w:t>
-            </w:r>
-            <w:proofErr w:type="gramStart"/>
-            <w:r>
-              <w:rPr>
-                <w:i/>
-                <w:iCs/>
-                <w:color w:val="8F9EAA"/>
-              </w:rPr>
-              <w:t>pantalla ]</w:t>
-            </w:r>
-            <w:proofErr w:type="gramEnd"/>
-          </w:p>
-        </w:tc>
-      </w:tr>
-    </w:tbl>
-    <w:p>
-      <w:pPr>
-        <w:spacing w:after="160"/>
-      </w:pPr>
-    </w:p>
-    <w:p>
-      <w:pPr>
-        <w:spacing w:after="80" w:line="260" w:lineRule="auto"/>
-        <w:jc w:val="both"/>
-      </w:pPr>
-      <w:r>
-        <w:rPr>
-          <w:b/>
-          <w:bCs/>
-          <w:color w:val="D97A2B"/>
-        </w:rPr>
-        <w:t xml:space="preserve">Captura N.º 12: </w:t>
-      </w:r>
-      <w:proofErr w:type="spellStart"/>
-      <w:r>
-        <w:t>job</w:t>
-      </w:r>
-      <w:proofErr w:type="spellEnd"/>
-      <w:r>
-        <w:t xml:space="preserve"> «calidad» en rojo con la salida de </w:t>
-      </w:r>
-      <w:proofErr w:type="spellStart"/>
-      <w:r>
-        <w:t>npm</w:t>
-      </w:r>
-      <w:proofErr w:type="spellEnd"/>
-      <w:r>
-        <w:t xml:space="preserve"> </w:t>
-      </w:r>
-      <w:proofErr w:type="spellStart"/>
-      <w:r>
-        <w:t>audit</w:t>
-      </w:r>
-      <w:proofErr w:type="spellEnd"/>
-      <w:r>
-        <w:t xml:space="preserve"> señalando la vulnerabilidad, y el pipeline detenido.</w:t>
-      </w:r>
-    </w:p>
-    <w:tbl>
-      <w:tblPr>
-        <w:tblW w:w="9746" w:type="dxa"/>
-        <w:tblBorders>
-          <w:top w:val="dashed" w:sz="4" w:space="0" w:color="D6DEE5"/>
-          <w:left w:val="dashed" w:sz="4" w:space="0" w:color="D6DEE5"/>
-          <w:bottom w:val="dashed" w:sz="4" w:space="0" w:color="D6DEE5"/>
-          <w:right w:val="dashed" w:sz="4" w:space="0" w:color="D6DEE5"/>
-          <w:insideH w:val="single" w:sz="4" w:space="0" w:color="auto"/>
-          <w:insideV w:val="single" w:sz="4" w:space="0" w:color="auto"/>
-        </w:tblBorders>
-        <w:tblCellMar>
-          <w:left w:w="10" w:type="dxa"/>
-          <w:right w:w="10" w:type="dxa"/>
-        </w:tblCellMar>
-        <w:tblLook w:val="04A0" w:firstRow="1" w:lastRow="0" w:firstColumn="1" w:lastColumn="0" w:noHBand="0" w:noVBand="1"/>
-      </w:tblPr>
-      <w:tblGrid>
-        <w:gridCol w:w="9746"/>
-      </w:tblGrid>
-      <w:tr>
-        <w:trPr>
-          <w:trHeight w:val="2100"/>
-        </w:trPr>
-        <w:tc>
-          <w:tcPr>
-            <w:tcW w:w="9746" w:type="dxa"/>
-            <w:tcMar>
-              <w:top w:w="60" w:type="dxa"/>
-              <w:left w:w="100" w:type="dxa"/>
-              <w:bottom w:w="60" w:type="dxa"/>
-              <w:right w:w="100" w:type="dxa"/>
-            </w:tcMar>
-            <w:vAlign w:val="center"/>
-          </w:tcPr>
-          <w:p>
-            <w:pPr>
-              <w:spacing w:before="800" w:after="800"/>
-              <w:jc w:val="center"/>
-            </w:pPr>
-            <w:r>
-              <w:rPr>
-                <w:i/>
-                <w:iCs/>
-                <w:color w:val="8F9EAA"/>
-              </w:rPr>
-              <w:t xml:space="preserve">[ Pegue aquí la captura de </w:t>
-            </w:r>
-            <w:proofErr w:type="gramStart"/>
-            <w:r>
-              <w:rPr>
-                <w:i/>
-                <w:iCs/>
-                <w:color w:val="8F9EAA"/>
-              </w:rPr>
-              <w:t>pantalla ]</w:t>
-            </w:r>
-            <w:proofErr w:type="gramEnd"/>
-          </w:p>
-        </w:tc>
-      </w:tr>
-    </w:tbl>
-    <w:p>
-      <w:pPr>
-        <w:spacing w:after="160"/>
-      </w:pPr>
-    </w:p>
-    <w:p>
-      <w:pPr>
-        <w:spacing w:after="80" w:line="260" w:lineRule="auto"/>
-        <w:jc w:val="both"/>
-      </w:pPr>
-      <w:proofErr w:type="gramStart"/>
-      <w:r>
-        <w:rPr>
-          <w:b/>
-          <w:bCs/>
-          <w:color w:val="0F3D5C"/>
-        </w:rPr>
-        <w:t>Pregunta N.º</w:t>
-      </w:r>
-      <w:proofErr w:type="gramEnd"/>
-      <w:r>
-        <w:rPr>
-          <w:b/>
-          <w:bCs/>
-          <w:color w:val="0F3D5C"/>
-        </w:rPr>
-        <w:t xml:space="preserve"> 5. </w:t>
-      </w:r>
-      <w:r>
-        <w:rPr>
-          <w:b/>
-          <w:bCs/>
-        </w:rPr>
-        <w:t>El análisis estático y el escaneo de dependencias no ejecutan una sola línea de su lógica de negocio. ¿Qué clase de defecto detecta cada uno que la suite de pruebas de la Práctica 7 nunca detectaría?</w:t>
-      </w:r>
-    </w:p>
-    <w:tbl>
-      <w:tblPr>
-        <w:tblW w:w="9746" w:type="dxa"/>
-        <w:tblBorders>
-          <w:top w:val="single" w:sz="4" w:space="0" w:color="D6DEE5"/>
-          <w:left w:val="single" w:sz="4" w:space="0" w:color="D6DEE5"/>
-          <w:bottom w:val="single" w:sz="4" w:space="0" w:color="D6DEE5"/>
-          <w:right w:val="single" w:sz="4" w:space="0" w:color="D6DEE5"/>
-          <w:insideH w:val="single" w:sz="4" w:space="0" w:color="auto"/>
-          <w:insideV w:val="single" w:sz="4" w:space="0" w:color="auto"/>
-        </w:tblBorders>
-        <w:tblCellMar>
-          <w:left w:w="10" w:type="dxa"/>
-          <w:right w:w="10" w:type="dxa"/>
-        </w:tblCellMar>
-        <w:tblLook w:val="04A0" w:firstRow="1" w:lastRow="0" w:firstColumn="1" w:lastColumn="0" w:noHBand="0" w:noVBand="1"/>
-      </w:tblPr>
-      <w:tblGrid>
-        <w:gridCol w:w="9746"/>
-      </w:tblGrid>
-      <w:tr>
-        <w:trPr>
-          <w:trHeight w:val="1400"/>
-        </w:trPr>
-        <w:tc>
-          <w:tcPr>
-            <w:tcW w:w="9746" w:type="dxa"/>
-            <w:tcMar>
-              <w:top w:w="60" w:type="dxa"/>
-              <w:left w:w="100" w:type="dxa"/>
-              <w:bottom w:w="60" w:type="dxa"/>
-              <w:right w:w="100" w:type="dxa"/>
-            </w:tcMar>
-            <w:vAlign w:val="center"/>
-          </w:tcPr>
-          <w:p/>
-        </w:tc>
-      </w:tr>
-    </w:tbl>
-    <w:p>
-      <w:pPr>
-        <w:spacing w:after="160"/>
-      </w:pPr>
-    </w:p>
-    <w:p>
-      <w:pPr>
-        <w:pBdr>
-          <w:bottom w:val="single" w:sz="6" w:space="3" w:color="D6DEE5"/>
-        </w:pBdr>
-        <w:spacing w:before="300" w:after="120"/>
-      </w:pPr>
-      <w:r>
-        <w:rPr>
-          <w:b/>
-          <w:bCs/>
-          <w:color w:val="0F3D5C"/>
-          <w:sz w:val="24"/>
-          <w:szCs w:val="24"/>
-        </w:rPr>
-        <w:t>Laboratorio 5 — Construir y publicar la imagen del servicio</w:t>
-      </w:r>
-    </w:p>
-    <w:p>
-      <w:pPr>
-        <w:spacing w:after="80" w:line="260" w:lineRule="auto"/>
-        <w:jc w:val="both"/>
-      </w:pPr>
-      <w:r>
-        <w:rPr>
-          <w:b/>
-          <w:bCs/>
-          <w:color w:val="D97A2B"/>
-        </w:rPr>
-        <w:t xml:space="preserve">Captura N.º 13: </w:t>
-      </w:r>
-      <w:r>
-        <w:t>grafo de la corrida mostrando «pruebas» y «calidad» en paralelo y «imagen» ejecutándose después de ambos.</w:t>
-      </w:r>
-    </w:p>
-    <w:tbl>
-      <w:tblPr>
-        <w:tblW w:w="9746" w:type="dxa"/>
-        <w:tblBorders>
-          <w:top w:val="dashed" w:sz="4" w:space="0" w:color="D6DEE5"/>
-          <w:left w:val="dashed" w:sz="4" w:space="0" w:color="D6DEE5"/>
-          <w:bottom w:val="dashed" w:sz="4" w:space="0" w:color="D6DEE5"/>
-          <w:right w:val="dashed" w:sz="4" w:space="0" w:color="D6DEE5"/>
-          <w:insideH w:val="single" w:sz="4" w:space="0" w:color="auto"/>
-          <w:insideV w:val="single" w:sz="4" w:space="0" w:color="auto"/>
-        </w:tblBorders>
-        <w:tblCellMar>
-          <w:left w:w="10" w:type="dxa"/>
-          <w:right w:w="10" w:type="dxa"/>
-        </w:tblCellMar>
-        <w:tblLook w:val="04A0" w:firstRow="1" w:lastRow="0" w:firstColumn="1" w:lastColumn="0" w:noHBand="0" w:noVBand="1"/>
-      </w:tblPr>
-      <w:tblGrid>
-        <w:gridCol w:w="9746"/>
-      </w:tblGrid>
-      <w:tr>
-        <w:trPr>
-          <w:trHeight w:val="2100"/>
-        </w:trPr>
-        <w:tc>
-          <w:tcPr>
-            <w:tcW w:w="9746" w:type="dxa"/>
-            <w:tcMar>
-              <w:top w:w="60" w:type="dxa"/>
-              <w:left w:w="100" w:type="dxa"/>
-              <w:bottom w:w="60" w:type="dxa"/>
-              <w:right w:w="100" w:type="dxa"/>
-            </w:tcMar>
-            <w:vAlign w:val="center"/>
-          </w:tcPr>
-          <w:p>
-            <w:pPr>
-              <w:spacing w:before="800" w:after="800"/>
-              <w:jc w:val="center"/>
-            </w:pPr>
-            <w:r>
-              <w:rPr>
-                <w:i/>
-                <w:iCs/>
-                <w:color w:val="8F9EAA"/>
-              </w:rPr>
-              <w:lastRenderedPageBreak/>
-              <w:t xml:space="preserve">[ Pegue aquí la captura de </w:t>
-            </w:r>
-            <w:proofErr w:type="gramStart"/>
-            <w:r>
-              <w:rPr>
-                <w:i/>
-                <w:iCs/>
-                <w:color w:val="8F9EAA"/>
-              </w:rPr>
-              <w:t>pantalla ]</w:t>
-            </w:r>
-            <w:proofErr w:type="gramEnd"/>
-          </w:p>
-        </w:tc>
-      </w:tr>
-    </w:tbl>
-    <w:p>
-      <w:pPr>
-        <w:spacing w:after="160"/>
-      </w:pPr>
-    </w:p>
-    <w:p>
-      <w:pPr>
-        <w:spacing w:after="80" w:line="260" w:lineRule="auto"/>
-        <w:jc w:val="both"/>
-      </w:pPr>
-      <w:r>
-        <w:rPr>
-          <w:b/>
-          <w:bCs/>
-          <w:color w:val="D97A2B"/>
-        </w:rPr>
-        <w:t xml:space="preserve">Captura N.º 14: </w:t>
-      </w:r>
-      <w:r>
-        <w:t xml:space="preserve">el paquete publicado en GitHub con sus dos etiquetas, y la terminal con el </w:t>
-      </w:r>
-      <w:proofErr w:type="spellStart"/>
-      <w:r>
-        <w:t>docker</w:t>
-      </w:r>
-      <w:proofErr w:type="spellEnd"/>
-      <w:r>
-        <w:t xml:space="preserve"> </w:t>
-      </w:r>
-      <w:proofErr w:type="spellStart"/>
-      <w:r>
-        <w:t>pull</w:t>
-      </w:r>
-      <w:proofErr w:type="spellEnd"/>
-      <w:r>
-        <w:t xml:space="preserve"> y el contenedor ejecutándose.</w:t>
-      </w:r>
-    </w:p>
-    <w:tbl>
-      <w:tblPr>
-        <w:tblW w:w="9746" w:type="dxa"/>
-        <w:tblBorders>
-          <w:top w:val="dashed" w:sz="4" w:space="0" w:color="D6DEE5"/>
-          <w:left w:val="dashed" w:sz="4" w:space="0" w:color="D6DEE5"/>
-          <w:bottom w:val="dashed" w:sz="4" w:space="0" w:color="D6DEE5"/>
-          <w:right w:val="dashed" w:sz="4" w:space="0" w:color="D6DEE5"/>
-          <w:insideH w:val="single" w:sz="4" w:space="0" w:color="auto"/>
-          <w:insideV w:val="single" w:sz="4" w:space="0" w:color="auto"/>
-        </w:tblBorders>
-        <w:tblCellMar>
-          <w:left w:w="10" w:type="dxa"/>
-          <w:right w:w="10" w:type="dxa"/>
-        </w:tblCellMar>
-        <w:tblLook w:val="04A0" w:firstRow="1" w:lastRow="0" w:firstColumn="1" w:lastColumn="0" w:noHBand="0" w:noVBand="1"/>
-      </w:tblPr>
-      <w:tblGrid>
-        <w:gridCol w:w="9746"/>
-      </w:tblGrid>
-      <w:tr>
-        <w:trPr>
-          <w:trHeight w:val="2100"/>
-        </w:trPr>
-        <w:tc>
-          <w:tcPr>
-            <w:tcW w:w="9746" w:type="dxa"/>
-            <w:tcMar>
-              <w:top w:w="60" w:type="dxa"/>
-              <w:left w:w="100" w:type="dxa"/>
-              <w:bottom w:w="60" w:type="dxa"/>
-              <w:right w:w="100" w:type="dxa"/>
-            </w:tcMar>
-            <w:vAlign w:val="center"/>
-          </w:tcPr>
-          <w:p>
-            <w:pPr>
-              <w:spacing w:before="800" w:after="800"/>
-              <w:jc w:val="center"/>
-            </w:pPr>
-            <w:r>
-              <w:rPr>
-                <w:i/>
-                <w:iCs/>
-                <w:color w:val="8F9EAA"/>
-              </w:rPr>
-              <w:t xml:space="preserve">[ Pegue aquí la captura de </w:t>
-            </w:r>
-            <w:proofErr w:type="gramStart"/>
-            <w:r>
-              <w:rPr>
-                <w:i/>
-                <w:iCs/>
-                <w:color w:val="8F9EAA"/>
-              </w:rPr>
-              <w:t>pantalla ]</w:t>
-            </w:r>
-            <w:proofErr w:type="gramEnd"/>
-          </w:p>
-        </w:tc>
-      </w:tr>
-    </w:tbl>
-    <w:p>
-      <w:pPr>
-        <w:spacing w:after="160"/>
-      </w:pPr>
-    </w:p>
-    <w:p>
-      <w:pPr>
-        <w:spacing w:after="80" w:line="260" w:lineRule="auto"/>
-        <w:jc w:val="both"/>
-      </w:pPr>
-      <w:proofErr w:type="gramStart"/>
-      <w:r>
-        <w:rPr>
-          <w:b/>
-          <w:bCs/>
-          <w:color w:val="0F3D5C"/>
-        </w:rPr>
-        <w:t>Pregunta N.º</w:t>
-      </w:r>
-      <w:proofErr w:type="gramEnd"/>
-      <w:r>
-        <w:rPr>
-          <w:b/>
-          <w:bCs/>
-          <w:color w:val="0F3D5C"/>
-        </w:rPr>
-        <w:t xml:space="preserve"> 6. </w:t>
-      </w:r>
-      <w:r>
-        <w:rPr>
-          <w:b/>
-          <w:bCs/>
-        </w:rPr>
-        <w:t xml:space="preserve">La imagen lleva dos etiquetas: el </w:t>
-      </w:r>
-      <w:proofErr w:type="spellStart"/>
-      <w:r>
-        <w:rPr>
-          <w:b/>
-          <w:bCs/>
-        </w:rPr>
-        <w:t>sha</w:t>
-      </w:r>
-      <w:proofErr w:type="spellEnd"/>
-      <w:r>
-        <w:rPr>
-          <w:b/>
-          <w:bCs/>
-        </w:rPr>
-        <w:t xml:space="preserve"> del </w:t>
-      </w:r>
-      <w:proofErr w:type="spellStart"/>
-      <w:r>
-        <w:rPr>
-          <w:b/>
-          <w:bCs/>
-        </w:rPr>
-        <w:t>commit</w:t>
-      </w:r>
-      <w:proofErr w:type="spellEnd"/>
-      <w:r>
-        <w:rPr>
-          <w:b/>
-          <w:bCs/>
-        </w:rPr>
-        <w:t xml:space="preserve"> y la versión 1.0.0. ¿Para qué sirve cada una y cuál usaría usted para investigar un error reportado en producción hace tres semanas?</w:t>
-      </w:r>
-    </w:p>
-    <w:tbl>
-      <w:tblPr>
-        <w:tblW w:w="9746" w:type="dxa"/>
-        <w:tblBorders>
-          <w:top w:val="single" w:sz="4" w:space="0" w:color="D6DEE5"/>
-          <w:left w:val="single" w:sz="4" w:space="0" w:color="D6DEE5"/>
-          <w:bottom w:val="single" w:sz="4" w:space="0" w:color="D6DEE5"/>
-          <w:right w:val="single" w:sz="4" w:space="0" w:color="D6DEE5"/>
-          <w:insideH w:val="single" w:sz="4" w:space="0" w:color="auto"/>
-          <w:insideV w:val="single" w:sz="4" w:space="0" w:color="auto"/>
-        </w:tblBorders>
-        <w:tblCellMar>
-          <w:left w:w="10" w:type="dxa"/>
-          <w:right w:w="10" w:type="dxa"/>
-        </w:tblCellMar>
-        <w:tblLook w:val="04A0" w:firstRow="1" w:lastRow="0" w:firstColumn="1" w:lastColumn="0" w:noHBand="0" w:noVBand="1"/>
-      </w:tblPr>
-      <w:tblGrid>
-        <w:gridCol w:w="9746"/>
-      </w:tblGrid>
-      <w:tr>
-        <w:trPr>
-          <w:trHeight w:val="1400"/>
-        </w:trPr>
-        <w:tc>
-          <w:tcPr>
-            <w:tcW w:w="9746" w:type="dxa"/>
-            <w:tcMar>
-              <w:top w:w="60" w:type="dxa"/>
-              <w:left w:w="100" w:type="dxa"/>
-              <w:bottom w:w="60" w:type="dxa"/>
-              <w:right w:w="100" w:type="dxa"/>
-            </w:tcMar>
-            <w:vAlign w:val="center"/>
-          </w:tcPr>
-          <w:p/>
-        </w:tc>
-      </w:tr>
-    </w:tbl>
-    <w:p>
-      <w:pPr>
-        <w:spacing w:after="160"/>
-      </w:pPr>
-    </w:p>
-    <w:p>
-      <w:pPr>
-        <w:pBdr>
-          <w:bottom w:val="single" w:sz="6" w:space="3" w:color="D6DEE5"/>
-        </w:pBdr>
-        <w:spacing w:before="300" w:after="120"/>
-      </w:pPr>
-      <w:r>
-        <w:rPr>
-          <w:b/>
-          <w:bCs/>
-          <w:color w:val="0F3D5C"/>
-          <w:sz w:val="24"/>
-          <w:szCs w:val="24"/>
-        </w:rPr>
-        <w:t>Laboratorio 6 — Proteger la rama principal</w:t>
-      </w:r>
-    </w:p>
-    <w:p>
-      <w:pPr>
-        <w:spacing w:after="80" w:line="260" w:lineRule="auto"/>
-        <w:jc w:val="both"/>
-      </w:pPr>
-      <w:r>
-        <w:rPr>
-          <w:b/>
-          <w:bCs/>
-          <w:color w:val="D97A2B"/>
-        </w:rPr>
-        <w:t xml:space="preserve">Captura N.º 15: </w:t>
-      </w:r>
-      <w:r>
-        <w:t xml:space="preserve">pantalla de configuración de la regla de protección de </w:t>
-      </w:r>
-      <w:proofErr w:type="spellStart"/>
-      <w:r>
-        <w:t>main</w:t>
-      </w:r>
-      <w:proofErr w:type="spellEnd"/>
-      <w:r>
-        <w:t xml:space="preserve"> con las condiciones marcadas y los </w:t>
-      </w:r>
-      <w:proofErr w:type="spellStart"/>
-      <w:r>
-        <w:t>checks</w:t>
-      </w:r>
-      <w:proofErr w:type="spellEnd"/>
-      <w:r>
-        <w:t xml:space="preserve"> obligatorios seleccionados.</w:t>
-      </w:r>
-    </w:p>
-    <w:tbl>
-      <w:tblPr>
-        <w:tblW w:w="9746" w:type="dxa"/>
-        <w:tblBorders>
-          <w:top w:val="dashed" w:sz="4" w:space="0" w:color="D6DEE5"/>
-          <w:left w:val="dashed" w:sz="4" w:space="0" w:color="D6DEE5"/>
-          <w:bottom w:val="dashed" w:sz="4" w:space="0" w:color="D6DEE5"/>
-          <w:right w:val="dashed" w:sz="4" w:space="0" w:color="D6DEE5"/>
-          <w:insideH w:val="single" w:sz="4" w:space="0" w:color="auto"/>
-          <w:insideV w:val="single" w:sz="4" w:space="0" w:color="auto"/>
-        </w:tblBorders>
-        <w:tblCellMar>
-          <w:left w:w="10" w:type="dxa"/>
-          <w:right w:w="10" w:type="dxa"/>
-        </w:tblCellMar>
-        <w:tblLook w:val="04A0" w:firstRow="1" w:lastRow="0" w:firstColumn="1" w:lastColumn="0" w:noHBand="0" w:noVBand="1"/>
-      </w:tblPr>
-      <w:tblGrid>
-        <w:gridCol w:w="9746"/>
-      </w:tblGrid>
-      <w:tr>
-        <w:trPr>
-          <w:trHeight w:val="2100"/>
-        </w:trPr>
-        <w:tc>
-          <w:tcPr>
-            <w:tcW w:w="9746" w:type="dxa"/>
-            <w:tcMar>
-              <w:top w:w="60" w:type="dxa"/>
-              <w:left w:w="100" w:type="dxa"/>
-              <w:bottom w:w="60" w:type="dxa"/>
-              <w:right w:w="100" w:type="dxa"/>
-            </w:tcMar>
-            <w:vAlign w:val="center"/>
-          </w:tcPr>
-          <w:p>
-            <w:pPr>
-              <w:spacing w:before="800" w:after="800"/>
-              <w:jc w:val="center"/>
-            </w:pPr>
-            <w:r>
-              <w:rPr>
-                <w:i/>
-                <w:iCs/>
-                <w:color w:val="8F9EAA"/>
-              </w:rPr>
-              <w:t xml:space="preserve">[ Pegue aquí la captura de </w:t>
-            </w:r>
-            <w:proofErr w:type="gramStart"/>
-            <w:r>
-              <w:rPr>
-                <w:i/>
-                <w:iCs/>
-                <w:color w:val="8F9EAA"/>
-              </w:rPr>
-              <w:t>pantalla ]</w:t>
-            </w:r>
-            <w:proofErr w:type="gramEnd"/>
-          </w:p>
-        </w:tc>
-      </w:tr>
-    </w:tbl>
-    <w:p>
-      <w:pPr>
-        <w:spacing w:after="160"/>
-      </w:pPr>
-    </w:p>
-    <w:p>
-      <w:pPr>
-        <w:spacing w:after="80" w:line="260" w:lineRule="auto"/>
-        <w:jc w:val="both"/>
-      </w:pPr>
-      <w:r>
-        <w:rPr>
-          <w:b/>
-          <w:bCs/>
-          <w:color w:val="D97A2B"/>
-        </w:rPr>
-        <w:t xml:space="preserve">Captura N.º 16: </w:t>
-      </w:r>
-      <w:proofErr w:type="spellStart"/>
-      <w:r>
-        <w:t>pull</w:t>
-      </w:r>
-      <w:proofErr w:type="spellEnd"/>
-      <w:r>
-        <w:t xml:space="preserve"> </w:t>
-      </w:r>
-      <w:proofErr w:type="spellStart"/>
-      <w:r>
-        <w:t>request</w:t>
-      </w:r>
-      <w:proofErr w:type="spellEnd"/>
-      <w:r>
-        <w:t xml:space="preserve"> con el </w:t>
-      </w:r>
-      <w:proofErr w:type="spellStart"/>
-      <w:r>
-        <w:t>check</w:t>
-      </w:r>
-      <w:proofErr w:type="spellEnd"/>
-      <w:r>
-        <w:t xml:space="preserve"> en rojo y el botón «</w:t>
-      </w:r>
-      <w:proofErr w:type="spellStart"/>
-      <w:r>
-        <w:t>Merge</w:t>
-      </w:r>
-      <w:proofErr w:type="spellEnd"/>
-      <w:r>
-        <w:t xml:space="preserve"> </w:t>
-      </w:r>
-      <w:proofErr w:type="spellStart"/>
-      <w:r>
-        <w:t>pull</w:t>
-      </w:r>
-      <w:proofErr w:type="spellEnd"/>
-      <w:r>
-        <w:t xml:space="preserve"> </w:t>
-      </w:r>
-      <w:proofErr w:type="spellStart"/>
-      <w:r>
-        <w:t>request</w:t>
-      </w:r>
-      <w:proofErr w:type="spellEnd"/>
-      <w:r>
-        <w:t xml:space="preserve">» bloqueado, con el mensaje de </w:t>
-      </w:r>
-      <w:proofErr w:type="spellStart"/>
-      <w:r>
-        <w:t>checks</w:t>
-      </w:r>
-      <w:proofErr w:type="spellEnd"/>
-      <w:r>
-        <w:t xml:space="preserve"> requeridos.</w:t>
-      </w:r>
-    </w:p>
-    <w:tbl>
-      <w:tblPr>
-        <w:tblW w:w="9746" w:type="dxa"/>
-        <w:tblBorders>
-          <w:top w:val="dashed" w:sz="4" w:space="0" w:color="D6DEE5"/>
-          <w:left w:val="dashed" w:sz="4" w:space="0" w:color="D6DEE5"/>
-          <w:bottom w:val="dashed" w:sz="4" w:space="0" w:color="D6DEE5"/>
-          <w:right w:val="dashed" w:sz="4" w:space="0" w:color="D6DEE5"/>
-          <w:insideH w:val="single" w:sz="4" w:space="0" w:color="auto"/>
-          <w:insideV w:val="single" w:sz="4" w:space="0" w:color="auto"/>
-        </w:tblBorders>
-        <w:tblCellMar>
-          <w:left w:w="10" w:type="dxa"/>
-          <w:right w:w="10" w:type="dxa"/>
-        </w:tblCellMar>
-        <w:tblLook w:val="04A0" w:firstRow="1" w:lastRow="0" w:firstColumn="1" w:lastColumn="0" w:noHBand="0" w:noVBand="1"/>
-      </w:tblPr>
-      <w:tblGrid>
-        <w:gridCol w:w="9746"/>
-      </w:tblGrid>
-      <w:tr>
-        <w:trPr>
-          <w:trHeight w:val="2100"/>
-        </w:trPr>
-        <w:tc>
-          <w:tcPr>
-            <w:tcW w:w="9746" w:type="dxa"/>
-            <w:tcMar>
-              <w:top w:w="60" w:type="dxa"/>
-              <w:left w:w="100" w:type="dxa"/>
-              <w:bottom w:w="60" w:type="dxa"/>
-              <w:right w:w="100" w:type="dxa"/>
-            </w:tcMar>
-            <w:vAlign w:val="center"/>
-          </w:tcPr>
-          <w:p>
-            <w:pPr>
-              <w:spacing w:before="800" w:after="800"/>
-              <w:jc w:val="center"/>
-            </w:pPr>
-            <w:r>
-              <w:rPr>
-                <w:i/>
-                <w:iCs/>
-                <w:color w:val="8F9EAA"/>
-              </w:rPr>
-              <w:lastRenderedPageBreak/>
-              <w:t xml:space="preserve">[ Pegue aquí la captura de </w:t>
-            </w:r>
-            <w:proofErr w:type="gramStart"/>
-            <w:r>
-              <w:rPr>
-                <w:i/>
-                <w:iCs/>
-                <w:color w:val="8F9EAA"/>
-              </w:rPr>
-              <w:t>pantalla ]</w:t>
-            </w:r>
-            <w:proofErr w:type="gramEnd"/>
-          </w:p>
-        </w:tc>
-      </w:tr>
-    </w:tbl>
-    <w:p>
-      <w:pPr>
-        <w:spacing w:after="160"/>
-      </w:pPr>
-    </w:p>
-    <w:p>
-      <w:pPr>
-        <w:spacing w:after="80" w:line="260" w:lineRule="auto"/>
-        <w:jc w:val="both"/>
-      </w:pPr>
-      <w:proofErr w:type="gramStart"/>
-      <w:r>
-        <w:rPr>
-          <w:b/>
-          <w:bCs/>
-          <w:color w:val="0F3D5C"/>
-        </w:rPr>
-        <w:t>Pregunta N.º</w:t>
-      </w:r>
-      <w:proofErr w:type="gramEnd"/>
-      <w:r>
-        <w:rPr>
-          <w:b/>
-          <w:bCs/>
-          <w:color w:val="0F3D5C"/>
-        </w:rPr>
-        <w:t xml:space="preserve"> 7. </w:t>
-      </w:r>
-      <w:r>
-        <w:rPr>
-          <w:b/>
-          <w:bCs/>
-        </w:rPr>
-        <w:t>Sin esta regla, el pipeline seguiría detectando el error y marcando el rojo. ¿Qué cambia exactamente al activarla y por qué eso importa más en un equipo de ocho personas que en un proyecto de una sola?</w:t>
-      </w:r>
-    </w:p>
-    <w:tbl>
-      <w:tblPr>
-        <w:tblW w:w="9746" w:type="dxa"/>
-        <w:tblBorders>
-          <w:top w:val="single" w:sz="4" w:space="0" w:color="D6DEE5"/>
-          <w:left w:val="single" w:sz="4" w:space="0" w:color="D6DEE5"/>
-          <w:bottom w:val="single" w:sz="4" w:space="0" w:color="D6DEE5"/>
-          <w:right w:val="single" w:sz="4" w:space="0" w:color="D6DEE5"/>
-          <w:insideH w:val="single" w:sz="4" w:space="0" w:color="auto"/>
-          <w:insideV w:val="single" w:sz="4" w:space="0" w:color="auto"/>
-        </w:tblBorders>
-        <w:tblCellMar>
-          <w:left w:w="10" w:type="dxa"/>
-          <w:right w:w="10" w:type="dxa"/>
-        </w:tblCellMar>
-        <w:tblLook w:val="04A0" w:firstRow="1" w:lastRow="0" w:firstColumn="1" w:lastColumn="0" w:noHBand="0" w:noVBand="1"/>
-      </w:tblPr>
-      <w:tblGrid>
-        <w:gridCol w:w="9746"/>
-      </w:tblGrid>
-      <w:tr>
-        <w:trPr>
-          <w:trHeight w:val="1400"/>
-        </w:trPr>
-        <w:tc>
-          <w:tcPr>
-            <w:tcW w:w="9746" w:type="dxa"/>
-            <w:tcMar>
-              <w:top w:w="60" w:type="dxa"/>
-              <w:left w:w="100" w:type="dxa"/>
-              <w:bottom w:w="60" w:type="dxa"/>
-              <w:right w:w="100" w:type="dxa"/>
-            </w:tcMar>
-            <w:vAlign w:val="center"/>
-          </w:tcPr>
-          <w:p/>
-        </w:tc>
-      </w:tr>
-    </w:tbl>
-    <w:p>
-      <w:pPr>
-        <w:spacing w:after="160"/>
-      </w:pPr>
-    </w:p>
-    <w:p>
-      <w:pPr>
-        <w:pBdr>
-          <w:bottom w:val="single" w:sz="6" w:space="3" w:color="D6DEE5"/>
-        </w:pBdr>
-        <w:spacing w:before="300" w:after="120"/>
-      </w:pPr>
-      <w:r>
-        <w:rPr>
-          <w:b/>
-          <w:bCs/>
-          <w:color w:val="0F3D5C"/>
-          <w:sz w:val="24"/>
-          <w:szCs w:val="24"/>
-        </w:rPr>
-        <w:t>Laboratorio 7 — Acelerar el pipeline y medirlo</w:t>
-      </w:r>
-    </w:p>
-    <w:p>
-      <w:pPr>
-        <w:spacing w:after="80" w:line="260" w:lineRule="auto"/>
-        <w:jc w:val="both"/>
-      </w:pPr>
-      <w:r>
-        <w:rPr>
-          <w:b/>
-          <w:bCs/>
-          <w:color w:val="D97A2B"/>
-        </w:rPr>
-        <w:t xml:space="preserve">Captura N.º 17: </w:t>
-      </w:r>
-      <w:r>
-        <w:t xml:space="preserve">corrida con los dos </w:t>
-      </w:r>
-      <w:proofErr w:type="spellStart"/>
-      <w:r>
-        <w:t>jobs</w:t>
-      </w:r>
-      <w:proofErr w:type="spellEnd"/>
-      <w:r>
-        <w:t xml:space="preserve"> de la matriz, «pruebas (20)» y «pruebas (22)», ejecutándose en paralelo.</w:t>
-      </w:r>
-    </w:p>
-    <w:tbl>
-      <w:tblPr>
-        <w:tblW w:w="9746" w:type="dxa"/>
-        <w:tblBorders>
-          <w:top w:val="dashed" w:sz="4" w:space="0" w:color="D6DEE5"/>
-          <w:left w:val="dashed" w:sz="4" w:space="0" w:color="D6DEE5"/>
-          <w:bottom w:val="dashed" w:sz="4" w:space="0" w:color="D6DEE5"/>
-          <w:right w:val="dashed" w:sz="4" w:space="0" w:color="D6DEE5"/>
-          <w:insideH w:val="single" w:sz="4" w:space="0" w:color="auto"/>
-          <w:insideV w:val="single" w:sz="4" w:space="0" w:color="auto"/>
-        </w:tblBorders>
-        <w:tblCellMar>
-          <w:left w:w="10" w:type="dxa"/>
-          <w:right w:w="10" w:type="dxa"/>
-        </w:tblCellMar>
-        <w:tblLook w:val="04A0" w:firstRow="1" w:lastRow="0" w:firstColumn="1" w:lastColumn="0" w:noHBand="0" w:noVBand="1"/>
-      </w:tblPr>
-      <w:tblGrid>
-        <w:gridCol w:w="9746"/>
-      </w:tblGrid>
-      <w:tr>
-        <w:trPr>
-          <w:trHeight w:val="2100"/>
-        </w:trPr>
-        <w:tc>
-          <w:tcPr>
-            <w:tcW w:w="9746" w:type="dxa"/>
-            <w:tcMar>
-              <w:top w:w="60" w:type="dxa"/>
-              <w:left w:w="100" w:type="dxa"/>
-              <w:bottom w:w="60" w:type="dxa"/>
-              <w:right w:w="100" w:type="dxa"/>
-            </w:tcMar>
-            <w:vAlign w:val="center"/>
-          </w:tcPr>
-          <w:p>
-            <w:pPr>
-              <w:spacing w:before="800" w:after="800"/>
-              <w:jc w:val="center"/>
-            </w:pPr>
-            <w:r>
-              <w:rPr>
-                <w:i/>
-                <w:iCs/>
-                <w:color w:val="8F9EAA"/>
-              </w:rPr>
-              <w:t xml:space="preserve">[ Pegue aquí la captura de </w:t>
-            </w:r>
-            <w:proofErr w:type="gramStart"/>
-            <w:r>
-              <w:rPr>
-                <w:i/>
-                <w:iCs/>
-                <w:color w:val="8F9EAA"/>
-              </w:rPr>
-              <w:t>pantalla ]</w:t>
-            </w:r>
-            <w:proofErr w:type="gramEnd"/>
-          </w:p>
-        </w:tc>
-      </w:tr>
-    </w:tbl>
-    <w:p>
-      <w:pPr>
-        <w:spacing w:after="160"/>
-      </w:pPr>
-    </w:p>
-    <w:p>
-      <w:pPr>
-        <w:spacing w:after="80" w:line="260" w:lineRule="auto"/>
-        <w:jc w:val="both"/>
-      </w:pPr>
-      <w:r>
-        <w:rPr>
-          <w:b/>
-          <w:bCs/>
-          <w:color w:val="D97A2B"/>
-        </w:rPr>
-        <w:t xml:space="preserve">Captura N.º 18: </w:t>
-      </w:r>
-      <w:r>
-        <w:t>la tabla comparativa de tiempos que usted construyó junto a la captura de la corrida donde se leen las duraciones.</w:t>
-      </w:r>
-    </w:p>
-    <w:tbl>
-      <w:tblPr>
-        <w:tblW w:w="9746" w:type="dxa"/>
-        <w:tblBorders>
-          <w:top w:val="dashed" w:sz="4" w:space="0" w:color="D6DEE5"/>
-          <w:left w:val="dashed" w:sz="4" w:space="0" w:color="D6DEE5"/>
-          <w:bottom w:val="dashed" w:sz="4" w:space="0" w:color="D6DEE5"/>
-          <w:right w:val="dashed" w:sz="4" w:space="0" w:color="D6DEE5"/>
-          <w:insideH w:val="single" w:sz="4" w:space="0" w:color="auto"/>
-          <w:insideV w:val="single" w:sz="4" w:space="0" w:color="auto"/>
-        </w:tblBorders>
-        <w:tblCellMar>
-          <w:left w:w="10" w:type="dxa"/>
-          <w:right w:w="10" w:type="dxa"/>
-        </w:tblCellMar>
-        <w:tblLook w:val="04A0" w:firstRow="1" w:lastRow="0" w:firstColumn="1" w:lastColumn="0" w:noHBand="0" w:noVBand="1"/>
-      </w:tblPr>
-      <w:tblGrid>
-        <w:gridCol w:w="9746"/>
-      </w:tblGrid>
-      <w:tr>
-        <w:trPr>
-          <w:trHeight w:val="2100"/>
-        </w:trPr>
-        <w:tc>
-          <w:tcPr>
-            <w:tcW w:w="9746" w:type="dxa"/>
-            <w:tcMar>
-              <w:top w:w="60" w:type="dxa"/>
-              <w:left w:w="100" w:type="dxa"/>
-              <w:bottom w:w="60" w:type="dxa"/>
-              <w:right w:w="100" w:type="dxa"/>
-            </w:tcMar>
-            <w:vAlign w:val="center"/>
-          </w:tcPr>
-          <w:p>
-            <w:pPr>
-              <w:spacing w:before="800" w:after="800"/>
-              <w:jc w:val="center"/>
-            </w:pPr>
-            <w:r>
-              <w:rPr>
-                <w:i/>
-                <w:iCs/>
-                <w:color w:val="8F9EAA"/>
-              </w:rPr>
-              <w:t xml:space="preserve">[ Pegue aquí la captura de </w:t>
-            </w:r>
-            <w:proofErr w:type="gramStart"/>
-            <w:r>
-              <w:rPr>
-                <w:i/>
-                <w:iCs/>
-                <w:color w:val="8F9EAA"/>
-              </w:rPr>
-              <w:t>pantalla ]</w:t>
-            </w:r>
-            <w:proofErr w:type="gramEnd"/>
-          </w:p>
-        </w:tc>
-      </w:tr>
-    </w:tbl>
-    <w:p>
-      <w:pPr>
-        <w:spacing w:after="160"/>
-      </w:pPr>
-    </w:p>
-    <w:p>
-      <w:pPr>
-        <w:spacing w:after="80" w:line="260" w:lineRule="auto"/>
-        <w:jc w:val="both"/>
-      </w:pPr>
-      <w:proofErr w:type="gramStart"/>
-      <w:r>
-        <w:rPr>
-          <w:b/>
-          <w:bCs/>
-          <w:color w:val="0F3D5C"/>
-        </w:rPr>
-        <w:t>Pregunta N.º</w:t>
-      </w:r>
-      <w:proofErr w:type="gramEnd"/>
-      <w:r>
-        <w:rPr>
-          <w:b/>
-          <w:bCs/>
-          <w:color w:val="0F3D5C"/>
-        </w:rPr>
-        <w:t xml:space="preserve"> 8. </w:t>
-      </w:r>
-      <w:r>
-        <w:rPr>
-          <w:b/>
-          <w:bCs/>
-        </w:rPr>
-        <w:t xml:space="preserve">Su pipeline tarda hoy cierto número de minutos. Si tardara cuarenta, ¿qué haría el equipo en la práctica y qué consecuencia tendría eso sobre la calidad del código que llega a </w:t>
-      </w:r>
-      <w:proofErr w:type="spellStart"/>
-      <w:r>
-        <w:rPr>
-          <w:b/>
-          <w:bCs/>
-        </w:rPr>
-        <w:t>main</w:t>
-      </w:r>
-      <w:proofErr w:type="spellEnd"/>
-      <w:r>
-        <w:rPr>
-          <w:b/>
-          <w:bCs/>
-        </w:rPr>
-        <w:t>?</w:t>
-      </w:r>
-    </w:p>
-    <w:tbl>
-      <w:tblPr>
-        <w:tblW w:w="9746" w:type="dxa"/>
-        <w:tblBorders>
-          <w:top w:val="single" w:sz="4" w:space="0" w:color="D6DEE5"/>
-          <w:left w:val="single" w:sz="4" w:space="0" w:color="D6DEE5"/>
-          <w:bottom w:val="single" w:sz="4" w:space="0" w:color="D6DEE5"/>
-          <w:right w:val="single" w:sz="4" w:space="0" w:color="D6DEE5"/>
-          <w:insideH w:val="single" w:sz="4" w:space="0" w:color="auto"/>
-          <w:insideV w:val="single" w:sz="4" w:space="0" w:color="auto"/>
-        </w:tblBorders>
-        <w:tblCellMar>
-          <w:left w:w="10" w:type="dxa"/>
-          <w:right w:w="10" w:type="dxa"/>
-        </w:tblCellMar>
-        <w:tblLook w:val="04A0" w:firstRow="1" w:lastRow="0" w:firstColumn="1" w:lastColumn="0" w:noHBand="0" w:noVBand="1"/>
-      </w:tblPr>
-      <w:tblGrid>
-        <w:gridCol w:w="9746"/>
-      </w:tblGrid>
-      <w:tr>
-        <w:trPr>
-          <w:trHeight w:val="1400"/>
-        </w:trPr>
-        <w:tc>
-          <w:tcPr>
-            <w:tcW w:w="9746" w:type="dxa"/>
-            <w:tcMar>
-              <w:top w:w="60" w:type="dxa"/>
-              <w:left w:w="100" w:type="dxa"/>
-              <w:bottom w:w="60" w:type="dxa"/>
-              <w:right w:w="100" w:type="dxa"/>
-            </w:tcMar>
-            <w:vAlign w:val="center"/>
-          </w:tcPr>
-          <w:p/>
-        </w:tc>
-      </w:tr>
-    </w:tbl>
-    <w:p>
-      <w:pPr>
-        <w:spacing w:after="160"/>
-      </w:pPr>
-    </w:p>
-    <w:p>
-      <w:pPr>
         <w:pBdr>
           <w:bottom w:val="single" w:sz="6" w:space="3" w:color="D6DEE5"/>
         </w:pBdr>
@@ -4005,6 +4324,7 @@
           <w:b/>
           <w:bCs/>
         </w:rPr>
+        <w:lastRenderedPageBreak/>
         <w:t>¿Qué error tuvo que resolver por su cuenta y cómo lo resolvió?</w:t>
       </w:r>
     </w:p>
@@ -4256,8 +4576,8 @@
     </w:tbl>
     <w:p/>
     <w:sectPr>
-      <w:headerReference w:type="default" r:id="rId10"/>
-      <w:footerReference w:type="default" r:id="rId11"/>
+      <w:headerReference w:type="default" r:id="rId19"/>
+      <w:footerReference w:type="default" r:id="rId20"/>
       <w:pgSz w:w="11906" w:h="16838"/>
       <w:pgMar w:top="1400" w:right="1080" w:bottom="1080" w:left="1080" w:header="560" w:footer="400" w:gutter="0"/>
       <w:cols w:space="720"/>
@@ -5223,7 +5543,6 @@
   <w:style w:type="character" w:default="1" w:styleId="Fuentedeprrafopredeter">
     <w:name w:val="Default Paragraph Font"/>
     <w:uiPriority w:val="1"/>
-    <w:semiHidden/>
     <w:unhideWhenUsed/>
   </w:style>
   <w:style w:type="table" w:default="1" w:styleId="Tablanormal">

</xml_diff>

<commit_message>
CI: publica la imagen en ghcr.io
</commit_message>
<xml_diff>
--- a/infrome9.docx
+++ b/infrome9.docx
@@ -1351,6 +1351,9 @@
               <w:jc w:val="center"/>
             </w:pPr>
             <w:r>
+              <w:rPr>
+                <w:noProof/>
+              </w:rPr>
               <w:lastRenderedPageBreak/>
               <w:drawing>
                 <wp:inline distT="0" distB="0" distL="0" distR="0" wp14:anchorId="27646D1E" wp14:editId="52BAD0D8">
@@ -1542,6 +1545,9 @@
               <w:jc w:val="center"/>
             </w:pPr>
             <w:r>
+              <w:rPr>
+                <w:noProof/>
+              </w:rPr>
               <w:lastRenderedPageBreak/>
               <w:drawing>
                 <wp:inline distT="0" distB="0" distL="0" distR="0" wp14:anchorId="5BADE45D" wp14:editId="391EB228">
@@ -1702,6 +1708,9 @@
               <w:jc w:val="center"/>
             </w:pPr>
             <w:r>
+              <w:rPr>
+                <w:noProof/>
+              </w:rPr>
               <w:lastRenderedPageBreak/>
               <w:drawing>
                 <wp:inline distT="0" distB="0" distL="0" distR="0" wp14:anchorId="2D775C10" wp14:editId="5713AD99">
@@ -1825,6 +1834,7 @@
               <w:rPr>
                 <w:i/>
                 <w:iCs/>
+                <w:noProof/>
                 <w:color w:val="8F9EAA"/>
               </w:rPr>
               <w:lastRenderedPageBreak/>
@@ -2103,6 +2113,7 @@
               <w:rPr>
                 <w:i/>
                 <w:iCs/>
+                <w:noProof/>
                 <w:color w:val="8F9EAA"/>
               </w:rPr>
               <w:lastRenderedPageBreak/>
@@ -2209,6 +2220,9 @@
               <w:jc w:val="center"/>
             </w:pPr>
             <w:r>
+              <w:rPr>
+                <w:noProof/>
+              </w:rPr>
               <w:lastRenderedPageBreak/>
               <w:drawing>
                 <wp:inline distT="0" distB="0" distL="0" distR="0" wp14:anchorId="642DCDA2" wp14:editId="4C36AEE5">
@@ -2419,6 +2433,7 @@
               <w:rPr>
                 <w:i/>
                 <w:iCs/>
+                <w:noProof/>
                 <w:color w:val="8F9EAA"/>
               </w:rPr>
               <w:lastRenderedPageBreak/>
@@ -2562,6 +2577,7 @@
               <w:rPr>
                 <w:i/>
                 <w:iCs/>
+                <w:noProof/>
                 <w:color w:val="8F9EAA"/>
               </w:rPr>
               <w:drawing>
@@ -2702,6 +2718,7 @@
               <w:rPr>
                 <w:i/>
                 <w:iCs/>
+                <w:noProof/>
                 <w:color w:val="8F9EAA"/>
               </w:rPr>
               <w:lastRenderedPageBreak/>
@@ -2923,6 +2940,7 @@
               <w:rPr>
                 <w:i/>
                 <w:iCs/>
+                <w:noProof/>
                 <w:color w:val="8F9EAA"/>
               </w:rPr>
               <w:lastRenderedPageBreak/>
@@ -2969,6 +2987,9 @@
               <w:t xml:space="preserve"> </w:t>
             </w:r>
             <w:r>
+              <w:rPr>
+                <w:noProof/>
+              </w:rPr>
               <w:drawing>
                 <wp:inline distT="0" distB="0" distL="0" distR="0" wp14:anchorId="6DE32204" wp14:editId="3D9CF24F">
                   <wp:extent cx="6188710" cy="3199130"/>
@@ -3075,7 +3096,7 @@
         <w:tblLook w:val="04A0" w:firstRow="1" w:lastRow="0" w:firstColumn="1" w:lastColumn="0" w:noHBand="0" w:noVBand="1"/>
       </w:tblPr>
       <w:tblGrid>
-        <w:gridCol w:w="9746"/>
+        <w:gridCol w:w="9950"/>
       </w:tblGrid>
       <w:tr>
         <w:trPr>
@@ -3104,18 +3125,171 @@
                 <w:color w:val="8F9EAA"/>
               </w:rPr>
               <w:lastRenderedPageBreak/>
-              <w:t xml:space="preserve">[ Pegue aquí la captura de </w:t>
-            </w:r>
-            <w:proofErr w:type="gramStart"/>
+              <w:drawing>
+                <wp:inline distT="0" distB="0" distL="0" distR="0" wp14:anchorId="36DBB859" wp14:editId="263BF48B">
+                  <wp:extent cx="6188710" cy="2209800"/>
+                  <wp:effectExtent l="0" t="0" r="2540" b="0"/>
+                  <wp:docPr id="267793819" name="Imagen 1"/>
+                  <wp:cNvGraphicFramePr>
+                    <a:graphicFrameLocks xmlns:a="http://schemas.openxmlformats.org/drawingml/2006/main" noChangeAspect="1"/>
+                  </wp:cNvGraphicFramePr>
+                  <a:graphic xmlns:a="http://schemas.openxmlformats.org/drawingml/2006/main">
+                    <a:graphicData uri="http://schemas.openxmlformats.org/drawingml/2006/picture">
+                      <pic:pic xmlns:pic="http://schemas.openxmlformats.org/drawingml/2006/picture">
+                        <pic:nvPicPr>
+                          <pic:cNvPr id="267793819" name=""/>
+                          <pic:cNvPicPr/>
+                        </pic:nvPicPr>
+                        <pic:blipFill>
+                          <a:blip r:embed="rId19"/>
+                          <a:stretch>
+                            <a:fillRect/>
+                          </a:stretch>
+                        </pic:blipFill>
+                        <pic:spPr>
+                          <a:xfrm>
+                            <a:off x="0" y="0"/>
+                            <a:ext cx="6188710" cy="2209800"/>
+                          </a:xfrm>
+                          <a:prstGeom prst="rect">
+                            <a:avLst/>
+                          </a:prstGeom>
+                        </pic:spPr>
+                      </pic:pic>
+                    </a:graphicData>
+                  </a:graphic>
+                </wp:inline>
+              </w:drawing>
+            </w:r>
+          </w:p>
+        </w:tc>
+      </w:tr>
+    </w:tbl>
+    <w:p>
+      <w:pPr>
+        <w:spacing w:after="160"/>
+      </w:pPr>
+    </w:p>
+    <w:p>
+      <w:pPr>
+        <w:spacing w:after="80" w:line="260" w:lineRule="auto"/>
+        <w:jc w:val="both"/>
+      </w:pPr>
+      <w:r>
+        <w:rPr>
+          <w:b/>
+          <w:bCs/>
+          <w:color w:val="D97A2B"/>
+        </w:rPr>
+        <w:t xml:space="preserve">Captura N.º 12: </w:t>
+      </w:r>
+      <w:proofErr w:type="spellStart"/>
+      <w:r>
+        <w:t>job</w:t>
+      </w:r>
+      <w:proofErr w:type="spellEnd"/>
+      <w:r>
+        <w:t xml:space="preserve"> «calidad» en rojo con la salida de </w:t>
+      </w:r>
+      <w:proofErr w:type="spellStart"/>
+      <w:r>
+        <w:t>npm</w:t>
+      </w:r>
+      <w:proofErr w:type="spellEnd"/>
+      <w:r>
+        <w:t xml:space="preserve"> </w:t>
+      </w:r>
+      <w:proofErr w:type="spellStart"/>
+      <w:r>
+        <w:t>audit</w:t>
+      </w:r>
+      <w:proofErr w:type="spellEnd"/>
+      <w:r>
+        <w:t xml:space="preserve"> señalando la vulnerabilidad, y el pipeline detenido.</w:t>
+      </w:r>
+    </w:p>
+    <w:tbl>
+      <w:tblPr>
+        <w:tblW w:w="9746" w:type="dxa"/>
+        <w:tblBorders>
+          <w:top w:val="dashed" w:sz="4" w:space="0" w:color="D6DEE5"/>
+          <w:left w:val="dashed" w:sz="4" w:space="0" w:color="D6DEE5"/>
+          <w:bottom w:val="dashed" w:sz="4" w:space="0" w:color="D6DEE5"/>
+          <w:right w:val="dashed" w:sz="4" w:space="0" w:color="D6DEE5"/>
+          <w:insideH w:val="single" w:sz="4" w:space="0" w:color="auto"/>
+          <w:insideV w:val="single" w:sz="4" w:space="0" w:color="auto"/>
+        </w:tblBorders>
+        <w:tblCellMar>
+          <w:left w:w="10" w:type="dxa"/>
+          <w:right w:w="10" w:type="dxa"/>
+        </w:tblCellMar>
+        <w:tblLook w:val="04A0" w:firstRow="1" w:lastRow="0" w:firstColumn="1" w:lastColumn="0" w:noHBand="0" w:noVBand="1"/>
+      </w:tblPr>
+      <w:tblGrid>
+        <w:gridCol w:w="9950"/>
+      </w:tblGrid>
+      <w:tr>
+        <w:trPr>
+          <w:trHeight w:val="2100"/>
+        </w:trPr>
+        <w:tc>
+          <w:tcPr>
+            <w:tcW w:w="9746" w:type="dxa"/>
+            <w:tcMar>
+              <w:top w:w="60" w:type="dxa"/>
+              <w:left w:w="100" w:type="dxa"/>
+              <w:bottom w:w="60" w:type="dxa"/>
+              <w:right w:w="100" w:type="dxa"/>
+            </w:tcMar>
+            <w:vAlign w:val="center"/>
+          </w:tcPr>
+          <w:p>
+            <w:pPr>
+              <w:spacing w:before="800" w:after="800"/>
+              <w:jc w:val="center"/>
+            </w:pPr>
             <w:r>
               <w:rPr>
                 <w:i/>
                 <w:iCs/>
                 <w:color w:val="8F9EAA"/>
               </w:rPr>
-              <w:t>pantalla ]</w:t>
-            </w:r>
-            <w:proofErr w:type="gramEnd"/>
+              <w:drawing>
+                <wp:inline distT="0" distB="0" distL="0" distR="0" wp14:anchorId="6CB6A3F4" wp14:editId="35BCBCC1">
+                  <wp:extent cx="6188710" cy="2814955"/>
+                  <wp:effectExtent l="0" t="0" r="2540" b="4445"/>
+                  <wp:docPr id="1396060332" name="Imagen 1"/>
+                  <wp:cNvGraphicFramePr>
+                    <a:graphicFrameLocks xmlns:a="http://schemas.openxmlformats.org/drawingml/2006/main" noChangeAspect="1"/>
+                  </wp:cNvGraphicFramePr>
+                  <a:graphic xmlns:a="http://schemas.openxmlformats.org/drawingml/2006/main">
+                    <a:graphicData uri="http://schemas.openxmlformats.org/drawingml/2006/picture">
+                      <pic:pic xmlns:pic="http://schemas.openxmlformats.org/drawingml/2006/picture">
+                        <pic:nvPicPr>
+                          <pic:cNvPr id="1396060332" name=""/>
+                          <pic:cNvPicPr/>
+                        </pic:nvPicPr>
+                        <pic:blipFill>
+                          <a:blip r:embed="rId20"/>
+                          <a:stretch>
+                            <a:fillRect/>
+                          </a:stretch>
+                        </pic:blipFill>
+                        <pic:spPr>
+                          <a:xfrm>
+                            <a:off x="0" y="0"/>
+                            <a:ext cx="6188710" cy="2814955"/>
+                          </a:xfrm>
+                          <a:prstGeom prst="rect">
+                            <a:avLst/>
+                          </a:prstGeom>
+                        </pic:spPr>
+                      </pic:pic>
+                    </a:graphicData>
+                  </a:graphic>
+                </wp:inline>
+              </w:drawing>
+            </w:r>
           </w:p>
         </w:tc>
       </w:tr>
@@ -3130,37 +3304,146 @@
         <w:spacing w:after="80" w:line="260" w:lineRule="auto"/>
         <w:jc w:val="both"/>
       </w:pPr>
+      <w:proofErr w:type="gramStart"/>
+      <w:r>
+        <w:rPr>
+          <w:b/>
+          <w:bCs/>
+          <w:color w:val="0F3D5C"/>
+        </w:rPr>
+        <w:t>Pregunta N.º</w:t>
+      </w:r>
+      <w:proofErr w:type="gramEnd"/>
+      <w:r>
+        <w:rPr>
+          <w:b/>
+          <w:bCs/>
+          <w:color w:val="0F3D5C"/>
+        </w:rPr>
+        <w:t xml:space="preserve"> 5. </w:t>
+      </w:r>
+      <w:r>
+        <w:rPr>
+          <w:b/>
+          <w:bCs/>
+        </w:rPr>
+        <w:t>El análisis estático y el escaneo de dependencias no ejecutan una sola línea de su lógica de negocio. ¿Qué clase de defecto detecta cada uno que la suite de pruebas de la Práctica 7 nunca detectaría?</w:t>
+      </w:r>
+    </w:p>
+    <w:tbl>
+      <w:tblPr>
+        <w:tblW w:w="9746" w:type="dxa"/>
+        <w:tblBorders>
+          <w:top w:val="single" w:sz="4" w:space="0" w:color="D6DEE5"/>
+          <w:left w:val="single" w:sz="4" w:space="0" w:color="D6DEE5"/>
+          <w:bottom w:val="single" w:sz="4" w:space="0" w:color="D6DEE5"/>
+          <w:right w:val="single" w:sz="4" w:space="0" w:color="D6DEE5"/>
+          <w:insideH w:val="single" w:sz="4" w:space="0" w:color="auto"/>
+          <w:insideV w:val="single" w:sz="4" w:space="0" w:color="auto"/>
+        </w:tblBorders>
+        <w:tblCellMar>
+          <w:left w:w="10" w:type="dxa"/>
+          <w:right w:w="10" w:type="dxa"/>
+        </w:tblCellMar>
+        <w:tblLook w:val="04A0" w:firstRow="1" w:lastRow="0" w:firstColumn="1" w:lastColumn="0" w:noHBand="0" w:noVBand="1"/>
+      </w:tblPr>
+      <w:tblGrid>
+        <w:gridCol w:w="9746"/>
+      </w:tblGrid>
+      <w:tr>
+        <w:trPr>
+          <w:trHeight w:val="1400"/>
+        </w:trPr>
+        <w:tc>
+          <w:tcPr>
+            <w:tcW w:w="9746" w:type="dxa"/>
+            <w:tcMar>
+              <w:top w:w="60" w:type="dxa"/>
+              <w:left w:w="100" w:type="dxa"/>
+              <w:bottom w:w="60" w:type="dxa"/>
+              <w:right w:w="100" w:type="dxa"/>
+            </w:tcMar>
+            <w:vAlign w:val="center"/>
+          </w:tcPr>
+          <w:p>
+            <w:proofErr w:type="spellStart"/>
+            <w:r>
+              <w:lastRenderedPageBreak/>
+              <w:t>ESLint</w:t>
+            </w:r>
+            <w:proofErr w:type="spellEnd"/>
+            <w:r>
+              <w:t xml:space="preserve"> detecta defectos estáticos del código: variables sin usar, errores de sintaxis, malas prácticas, código muerto — cosas que la suite de pruebas no ve porque solo verifica el comportamiento observable.</w:t>
+            </w:r>
+          </w:p>
+          <w:p/>
+          <w:p>
+            <w:proofErr w:type="spellStart"/>
+            <w:r>
+              <w:t>npm</w:t>
+            </w:r>
+            <w:proofErr w:type="spellEnd"/>
+            <w:r>
+              <w:t xml:space="preserve"> </w:t>
+            </w:r>
+            <w:proofErr w:type="spellStart"/>
+            <w:r>
+              <w:t>audit</w:t>
+            </w:r>
+            <w:proofErr w:type="spellEnd"/>
+            <w:r>
+              <w:t xml:space="preserve"> detecta vulnerabilidades conocidas en las dependencias (</w:t>
+            </w:r>
+            <w:proofErr w:type="spellStart"/>
+            <w:r>
+              <w:t>CVEs</w:t>
+            </w:r>
+            <w:proofErr w:type="spellEnd"/>
+            <w:r>
+              <w:t>). La suite no las detecta porque el código puede funcionar bien y aun así arrastrar una librería con un fallo de seguridad publicado.</w:t>
+            </w:r>
+          </w:p>
+        </w:tc>
+      </w:tr>
+    </w:tbl>
+    <w:p>
+      <w:pPr>
+        <w:spacing w:after="160"/>
+      </w:pPr>
+    </w:p>
+    <w:p>
+      <w:pPr>
+        <w:pBdr>
+          <w:bottom w:val="single" w:sz="6" w:space="3" w:color="D6DEE5"/>
+        </w:pBdr>
+        <w:spacing w:before="300" w:after="120"/>
+      </w:pPr>
+      <w:r>
+        <w:rPr>
+          <w:b/>
+          <w:bCs/>
+          <w:color w:val="0F3D5C"/>
+          <w:sz w:val="24"/>
+          <w:szCs w:val="24"/>
+        </w:rPr>
+        <w:t>Laboratorio 5 — Construir y publicar la imagen del servicio</w:t>
+      </w:r>
+    </w:p>
+    <w:p>
+      <w:pPr>
+        <w:spacing w:after="80" w:line="260" w:lineRule="auto"/>
+        <w:jc w:val="both"/>
+      </w:pPr>
       <w:r>
         <w:rPr>
           <w:b/>
           <w:bCs/>
           <w:color w:val="D97A2B"/>
         </w:rPr>
-        <w:t xml:space="preserve">Captura N.º 12: </w:t>
-      </w:r>
-      <w:proofErr w:type="spellStart"/>
-      <w:r>
-        <w:t>job</w:t>
-      </w:r>
-      <w:proofErr w:type="spellEnd"/>
-      <w:r>
-        <w:t xml:space="preserve"> «calidad» en rojo con la salida de </w:t>
-      </w:r>
-      <w:proofErr w:type="spellStart"/>
-      <w:r>
-        <w:t>npm</w:t>
-      </w:r>
-      <w:proofErr w:type="spellEnd"/>
-      <w:r>
-        <w:t xml:space="preserve"> </w:t>
-      </w:r>
-      <w:proofErr w:type="spellStart"/>
-      <w:r>
-        <w:t>audit</w:t>
-      </w:r>
-      <w:proofErr w:type="spellEnd"/>
-      <w:r>
-        <w:t xml:space="preserve"> señalando la vulnerabilidad, y el pipeline detenido.</w:t>
+        <w:t xml:space="preserve">Captura N.º 13: </w:t>
+      </w:r>
+      <w:r>
+        <w:t>grafo de la corrida mostrando «pruebas» y «calidad» en paralelo y «imagen» ejecutándose después de ambos.</w:t>
       </w:r>
     </w:p>
     <w:tbl>
@@ -3235,6 +3518,106 @@
         <w:spacing w:after="80" w:line="260" w:lineRule="auto"/>
         <w:jc w:val="both"/>
       </w:pPr>
+      <w:r>
+        <w:rPr>
+          <w:b/>
+          <w:bCs/>
+          <w:color w:val="D97A2B"/>
+        </w:rPr>
+        <w:t xml:space="preserve">Captura N.º 14: </w:t>
+      </w:r>
+      <w:r>
+        <w:t xml:space="preserve">el paquete publicado en GitHub con sus dos etiquetas, y la terminal con el </w:t>
+      </w:r>
+      <w:proofErr w:type="spellStart"/>
+      <w:r>
+        <w:t>docker</w:t>
+      </w:r>
+      <w:proofErr w:type="spellEnd"/>
+      <w:r>
+        <w:t xml:space="preserve"> </w:t>
+      </w:r>
+      <w:proofErr w:type="spellStart"/>
+      <w:r>
+        <w:t>pull</w:t>
+      </w:r>
+      <w:proofErr w:type="spellEnd"/>
+      <w:r>
+        <w:t xml:space="preserve"> y el contenedor ejecutándose.</w:t>
+      </w:r>
+    </w:p>
+    <w:tbl>
+      <w:tblPr>
+        <w:tblW w:w="9746" w:type="dxa"/>
+        <w:tblBorders>
+          <w:top w:val="dashed" w:sz="4" w:space="0" w:color="D6DEE5"/>
+          <w:left w:val="dashed" w:sz="4" w:space="0" w:color="D6DEE5"/>
+          <w:bottom w:val="dashed" w:sz="4" w:space="0" w:color="D6DEE5"/>
+          <w:right w:val="dashed" w:sz="4" w:space="0" w:color="D6DEE5"/>
+          <w:insideH w:val="single" w:sz="4" w:space="0" w:color="auto"/>
+          <w:insideV w:val="single" w:sz="4" w:space="0" w:color="auto"/>
+        </w:tblBorders>
+        <w:tblCellMar>
+          <w:left w:w="10" w:type="dxa"/>
+          <w:right w:w="10" w:type="dxa"/>
+        </w:tblCellMar>
+        <w:tblLook w:val="04A0" w:firstRow="1" w:lastRow="0" w:firstColumn="1" w:lastColumn="0" w:noHBand="0" w:noVBand="1"/>
+      </w:tblPr>
+      <w:tblGrid>
+        <w:gridCol w:w="9746"/>
+      </w:tblGrid>
+      <w:tr>
+        <w:trPr>
+          <w:trHeight w:val="2100"/>
+        </w:trPr>
+        <w:tc>
+          <w:tcPr>
+            <w:tcW w:w="9746" w:type="dxa"/>
+            <w:tcMar>
+              <w:top w:w="60" w:type="dxa"/>
+              <w:left w:w="100" w:type="dxa"/>
+              <w:bottom w:w="60" w:type="dxa"/>
+              <w:right w:w="100" w:type="dxa"/>
+            </w:tcMar>
+            <w:vAlign w:val="center"/>
+          </w:tcPr>
+          <w:p>
+            <w:pPr>
+              <w:spacing w:before="800" w:after="800"/>
+              <w:jc w:val="center"/>
+            </w:pPr>
+            <w:r>
+              <w:rPr>
+                <w:i/>
+                <w:iCs/>
+                <w:color w:val="8F9EAA"/>
+              </w:rPr>
+              <w:t xml:space="preserve">[ Pegue aquí la captura de </w:t>
+            </w:r>
+            <w:proofErr w:type="gramStart"/>
+            <w:r>
+              <w:rPr>
+                <w:i/>
+                <w:iCs/>
+                <w:color w:val="8F9EAA"/>
+              </w:rPr>
+              <w:t>pantalla ]</w:t>
+            </w:r>
+            <w:proofErr w:type="gramEnd"/>
+          </w:p>
+        </w:tc>
+      </w:tr>
+    </w:tbl>
+    <w:p>
+      <w:pPr>
+        <w:spacing w:after="160"/>
+      </w:pPr>
+    </w:p>
+    <w:p>
+      <w:pPr>
+        <w:spacing w:after="80" w:line="260" w:lineRule="auto"/>
+        <w:jc w:val="both"/>
+      </w:pPr>
       <w:proofErr w:type="gramStart"/>
       <w:r>
         <w:rPr>
@@ -3251,14 +3634,46 @@
           <w:bCs/>
           <w:color w:val="0F3D5C"/>
         </w:rPr>
-        <w:t xml:space="preserve"> 5. </w:t>
-      </w:r>
-      <w:r>
-        <w:rPr>
-          <w:b/>
-          <w:bCs/>
-        </w:rPr>
-        <w:t>El análisis estático y el escaneo de dependencias no ejecutan una sola línea de su lógica de negocio. ¿Qué clase de defecto detecta cada uno que la suite de pruebas de la Práctica 7 nunca detectaría?</w:t>
+        <w:t xml:space="preserve"> 6. </w:t>
+      </w:r>
+      <w:r>
+        <w:rPr>
+          <w:b/>
+          <w:bCs/>
+        </w:rPr>
+        <w:t xml:space="preserve">La imagen lleva dos etiquetas: el </w:t>
+      </w:r>
+      <w:proofErr w:type="spellStart"/>
+      <w:r>
+        <w:rPr>
+          <w:b/>
+          <w:bCs/>
+        </w:rPr>
+        <w:t>sha</w:t>
+      </w:r>
+      <w:proofErr w:type="spellEnd"/>
+      <w:r>
+        <w:rPr>
+          <w:b/>
+          <w:bCs/>
+        </w:rPr>
+        <w:t xml:space="preserve"> del </w:t>
+      </w:r>
+      <w:proofErr w:type="spellStart"/>
+      <w:r>
+        <w:rPr>
+          <w:b/>
+          <w:bCs/>
+        </w:rPr>
+        <w:t>commit</w:t>
+      </w:r>
+      <w:proofErr w:type="spellEnd"/>
+      <w:r>
+        <w:rPr>
+          <w:b/>
+          <w:bCs/>
+        </w:rPr>
+        <w:t xml:space="preserve"> y la versión 1.0.0. ¿Para qué sirve cada una y cuál usaría usted para investigar un error reportado en producción hace tres semanas?</w:t>
       </w:r>
     </w:p>
     <w:tbl>
@@ -3320,7 +3735,7 @@
           <w:sz w:val="24"/>
           <w:szCs w:val="24"/>
         </w:rPr>
-        <w:t>Laboratorio 5 — Construir y publicar la imagen del servicio</w:t>
+        <w:t>Laboratorio 6 — Proteger la rama principal</w:t>
       </w:r>
     </w:p>
     <w:p>
@@ -3334,10 +3749,26 @@
           <w:bCs/>
           <w:color w:val="D97A2B"/>
         </w:rPr>
-        <w:t xml:space="preserve">Captura N.º 13: </w:t>
-      </w:r>
-      <w:r>
-        <w:t>grafo de la corrida mostrando «pruebas» y «calidad» en paralelo y «imagen» ejecutándose después de ambos.</w:t>
+        <w:t xml:space="preserve">Captura N.º 15: </w:t>
+      </w:r>
+      <w:r>
+        <w:t xml:space="preserve">pantalla de configuración de la regla de protección de </w:t>
+      </w:r>
+      <w:proofErr w:type="spellStart"/>
+      <w:r>
+        <w:t>main</w:t>
+      </w:r>
+      <w:proofErr w:type="spellEnd"/>
+      <w:r>
+        <w:t xml:space="preserve"> con las condiciones marcadas y los </w:t>
+      </w:r>
+      <w:proofErr w:type="spellStart"/>
+      <w:r>
+        <w:t>checks</w:t>
+      </w:r>
+      <w:proofErr w:type="spellEnd"/>
+      <w:r>
+        <w:t xml:space="preserve"> obligatorios seleccionados.</w:t>
       </w:r>
     </w:p>
     <w:tbl>
@@ -3386,6 +3817,7 @@
                 <w:iCs/>
                 <w:color w:val="8F9EAA"/>
               </w:rPr>
+              <w:lastRenderedPageBreak/>
               <w:t xml:space="preserve">[ Pegue aquí la captura de </w:t>
             </w:r>
             <w:proofErr w:type="gramStart"/>
@@ -3418,14 +3850,11 @@
           <w:bCs/>
           <w:color w:val="D97A2B"/>
         </w:rPr>
-        <w:t xml:space="preserve">Captura N.º 14: </w:t>
-      </w:r>
-      <w:r>
-        <w:t xml:space="preserve">el paquete publicado en GitHub con sus dos etiquetas, y la terminal con el </w:t>
+        <w:t xml:space="preserve">Captura N.º 16: </w:t>
       </w:r>
       <w:proofErr w:type="spellStart"/>
       <w:r>
-        <w:t>docker</w:t>
+        <w:t>pull</w:t>
       </w:r>
       <w:proofErr w:type="spellEnd"/>
       <w:r>
@@ -3433,11 +3862,51 @@
       </w:r>
       <w:proofErr w:type="spellStart"/>
       <w:r>
+        <w:t>request</w:t>
+      </w:r>
+      <w:proofErr w:type="spellEnd"/>
+      <w:r>
+        <w:t xml:space="preserve"> con el </w:t>
+      </w:r>
+      <w:proofErr w:type="spellStart"/>
+      <w:r>
+        <w:t>check</w:t>
+      </w:r>
+      <w:proofErr w:type="spellEnd"/>
+      <w:r>
+        <w:t xml:space="preserve"> en rojo y el botón «</w:t>
+      </w:r>
+      <w:proofErr w:type="spellStart"/>
+      <w:r>
+        <w:t>Merge</w:t>
+      </w:r>
+      <w:proofErr w:type="spellEnd"/>
+      <w:r>
+        <w:t xml:space="preserve"> </w:t>
+      </w:r>
+      <w:proofErr w:type="spellStart"/>
+      <w:r>
         <w:t>pull</w:t>
       </w:r>
       <w:proofErr w:type="spellEnd"/>
       <w:r>
-        <w:t xml:space="preserve"> y el contenedor ejecutándose.</w:t>
+        <w:t xml:space="preserve"> </w:t>
+      </w:r>
+      <w:proofErr w:type="spellStart"/>
+      <w:r>
+        <w:t>request</w:t>
+      </w:r>
+      <w:proofErr w:type="spellEnd"/>
+      <w:r>
+        <w:t xml:space="preserve">» bloqueado, con el mensaje de </w:t>
+      </w:r>
+      <w:proofErr w:type="spellStart"/>
+      <w:r>
+        <w:t>checks</w:t>
+      </w:r>
+      <w:proofErr w:type="spellEnd"/>
+      <w:r>
+        <w:t xml:space="preserve"> requeridos.</w:t>
       </w:r>
     </w:p>
     <w:tbl>
@@ -3486,7 +3955,6 @@
                 <w:iCs/>
                 <w:color w:val="8F9EAA"/>
               </w:rPr>
-              <w:lastRenderedPageBreak/>
               <w:t xml:space="preserve">[ Pegue aquí la captura de </w:t>
             </w:r>
             <w:proofErr w:type="gramStart"/>
@@ -3529,46 +3997,14 @@
           <w:bCs/>
           <w:color w:val="0F3D5C"/>
         </w:rPr>
-        <w:t xml:space="preserve"> 6. </w:t>
-      </w:r>
-      <w:r>
-        <w:rPr>
-          <w:b/>
-          <w:bCs/>
-        </w:rPr>
-        <w:t xml:space="preserve">La imagen lleva dos etiquetas: el </w:t>
-      </w:r>
-      <w:proofErr w:type="spellStart"/>
-      <w:r>
-        <w:rPr>
-          <w:b/>
-          <w:bCs/>
-        </w:rPr>
-        <w:t>sha</w:t>
-      </w:r>
-      <w:proofErr w:type="spellEnd"/>
-      <w:r>
-        <w:rPr>
-          <w:b/>
-          <w:bCs/>
-        </w:rPr>
-        <w:t xml:space="preserve"> del </w:t>
-      </w:r>
-      <w:proofErr w:type="spellStart"/>
-      <w:r>
-        <w:rPr>
-          <w:b/>
-          <w:bCs/>
-        </w:rPr>
-        <w:t>commit</w:t>
-      </w:r>
-      <w:proofErr w:type="spellEnd"/>
-      <w:r>
-        <w:rPr>
-          <w:b/>
-          <w:bCs/>
-        </w:rPr>
-        <w:t xml:space="preserve"> y la versión 1.0.0. ¿Para qué sirve cada una y cuál usaría usted para investigar un error reportado en producción hace tres semanas?</w:t>
+        <w:t xml:space="preserve"> 7. </w:t>
+      </w:r>
+      <w:r>
+        <w:rPr>
+          <w:b/>
+          <w:bCs/>
+        </w:rPr>
+        <w:t>Sin esta regla, el pipeline seguiría detectando el error y marcando el rojo. ¿Qué cambia exactamente al activarla y por qué eso importa más en un equipo de ocho personas que en un proyecto de una sola?</w:t>
       </w:r>
     </w:p>
     <w:tbl>
@@ -3630,7 +4066,7 @@
           <w:sz w:val="24"/>
           <w:szCs w:val="24"/>
         </w:rPr>
-        <w:t>Laboratorio 6 — Proteger la rama principal</w:t>
+        <w:t>Laboratorio 7 — Acelerar el pipeline y medirlo</w:t>
       </w:r>
     </w:p>
     <w:p>
@@ -3644,26 +4080,18 @@
           <w:bCs/>
           <w:color w:val="D97A2B"/>
         </w:rPr>
-        <w:t xml:space="preserve">Captura N.º 15: </w:t>
-      </w:r>
-      <w:r>
-        <w:t xml:space="preserve">pantalla de configuración de la regla de protección de </w:t>
+        <w:t xml:space="preserve">Captura N.º 17: </w:t>
+      </w:r>
+      <w:r>
+        <w:t xml:space="preserve">corrida con los dos </w:t>
       </w:r>
       <w:proofErr w:type="spellStart"/>
       <w:r>
-        <w:t>main</w:t>
+        <w:t>jobs</w:t>
       </w:r>
       <w:proofErr w:type="spellEnd"/>
       <w:r>
-        <w:t xml:space="preserve"> con las condiciones marcadas y los </w:t>
-      </w:r>
-      <w:proofErr w:type="spellStart"/>
-      <w:r>
-        <w:t>checks</w:t>
-      </w:r>
-      <w:proofErr w:type="spellEnd"/>
-      <w:r>
-        <w:t xml:space="preserve"> obligatorios seleccionados.</w:t>
+        <w:t xml:space="preserve"> de la matriz, «pruebas (20)» y «pruebas (22)», ejecutándose en paralelo.</w:t>
       </w:r>
     </w:p>
     <w:tbl>
@@ -3744,63 +4172,10 @@
           <w:bCs/>
           <w:color w:val="D97A2B"/>
         </w:rPr>
-        <w:t xml:space="preserve">Captura N.º 16: </w:t>
-      </w:r>
-      <w:proofErr w:type="spellStart"/>
-      <w:r>
-        <w:t>pull</w:t>
-      </w:r>
-      <w:proofErr w:type="spellEnd"/>
-      <w:r>
-        <w:t xml:space="preserve"> </w:t>
-      </w:r>
-      <w:proofErr w:type="spellStart"/>
-      <w:r>
-        <w:t>request</w:t>
-      </w:r>
-      <w:proofErr w:type="spellEnd"/>
-      <w:r>
-        <w:t xml:space="preserve"> con el </w:t>
-      </w:r>
-      <w:proofErr w:type="spellStart"/>
-      <w:r>
-        <w:t>check</w:t>
-      </w:r>
-      <w:proofErr w:type="spellEnd"/>
-      <w:r>
-        <w:t xml:space="preserve"> en rojo y el botón «</w:t>
-      </w:r>
-      <w:proofErr w:type="spellStart"/>
-      <w:r>
-        <w:t>Merge</w:t>
-      </w:r>
-      <w:proofErr w:type="spellEnd"/>
-      <w:r>
-        <w:t xml:space="preserve"> </w:t>
-      </w:r>
-      <w:proofErr w:type="spellStart"/>
-      <w:r>
-        <w:t>pull</w:t>
-      </w:r>
-      <w:proofErr w:type="spellEnd"/>
-      <w:r>
-        <w:t xml:space="preserve"> </w:t>
-      </w:r>
-      <w:proofErr w:type="spellStart"/>
-      <w:r>
-        <w:t>request</w:t>
-      </w:r>
-      <w:proofErr w:type="spellEnd"/>
-      <w:r>
-        <w:t xml:space="preserve">» bloqueado, con el mensaje de </w:t>
-      </w:r>
-      <w:proofErr w:type="spellStart"/>
-      <w:r>
-        <w:t>checks</w:t>
-      </w:r>
-      <w:proofErr w:type="spellEnd"/>
-      <w:r>
-        <w:t xml:space="preserve"> requeridos.</w:t>
+        <w:t xml:space="preserve">Captura N.º 18: </w:t>
+      </w:r>
+      <w:r>
+        <w:t>la tabla comparativa de tiempos que usted construyó junto a la captura de la corrida donde se leen las duraciones.</w:t>
       </w:r>
     </w:p>
     <w:tbl>
@@ -3849,6 +4224,7 @@
                 <w:iCs/>
                 <w:color w:val="8F9EAA"/>
               </w:rPr>
+              <w:lastRenderedPageBreak/>
               <w:t xml:space="preserve">[ Pegue aquí la captura de </w:t>
             </w:r>
             <w:proofErr w:type="gramStart"/>
@@ -3891,14 +4267,30 @@
           <w:bCs/>
           <w:color w:val="0F3D5C"/>
         </w:rPr>
-        <w:t xml:space="preserve"> 7. </w:t>
-      </w:r>
-      <w:r>
-        <w:rPr>
-          <w:b/>
-          <w:bCs/>
-        </w:rPr>
-        <w:t>Sin esta regla, el pipeline seguiría detectando el error y marcando el rojo. ¿Qué cambia exactamente al activarla y por qué eso importa más en un equipo de ocho personas que en un proyecto de una sola?</w:t>
+        <w:t xml:space="preserve"> 8. </w:t>
+      </w:r>
+      <w:r>
+        <w:rPr>
+          <w:b/>
+          <w:bCs/>
+        </w:rPr>
+        <w:t xml:space="preserve">Su pipeline tarda hoy cierto número de minutos. Si tardara cuarenta, ¿qué haría el equipo en la práctica y qué consecuencia tendría eso sobre la calidad del código que llega a </w:t>
+      </w:r>
+      <w:proofErr w:type="spellStart"/>
+      <w:r>
+        <w:rPr>
+          <w:b/>
+          <w:bCs/>
+        </w:rPr>
+        <w:t>main</w:t>
+      </w:r>
+      <w:proofErr w:type="spellEnd"/>
+      <w:r>
+        <w:rPr>
+          <w:b/>
+          <w:bCs/>
+        </w:rPr>
+        <w:t>?</w:t>
       </w:r>
     </w:p>
     <w:tbl>
@@ -3960,291 +4352,6 @@
           <w:sz w:val="24"/>
           <w:szCs w:val="24"/>
         </w:rPr>
-        <w:t>Laboratorio 7 — Acelerar el pipeline y medirlo</w:t>
-      </w:r>
-    </w:p>
-    <w:p>
-      <w:pPr>
-        <w:spacing w:after="80" w:line="260" w:lineRule="auto"/>
-        <w:jc w:val="both"/>
-      </w:pPr>
-      <w:r>
-        <w:rPr>
-          <w:b/>
-          <w:bCs/>
-          <w:color w:val="D97A2B"/>
-        </w:rPr>
-        <w:t xml:space="preserve">Captura N.º 17: </w:t>
-      </w:r>
-      <w:r>
-        <w:t xml:space="preserve">corrida con los dos </w:t>
-      </w:r>
-      <w:proofErr w:type="spellStart"/>
-      <w:r>
-        <w:t>jobs</w:t>
-      </w:r>
-      <w:proofErr w:type="spellEnd"/>
-      <w:r>
-        <w:t xml:space="preserve"> de la matriz, «pruebas (20)» y «pruebas (22)», ejecutándose en paralelo.</w:t>
-      </w:r>
-    </w:p>
-    <w:tbl>
-      <w:tblPr>
-        <w:tblW w:w="9746" w:type="dxa"/>
-        <w:tblBorders>
-          <w:top w:val="dashed" w:sz="4" w:space="0" w:color="D6DEE5"/>
-          <w:left w:val="dashed" w:sz="4" w:space="0" w:color="D6DEE5"/>
-          <w:bottom w:val="dashed" w:sz="4" w:space="0" w:color="D6DEE5"/>
-          <w:right w:val="dashed" w:sz="4" w:space="0" w:color="D6DEE5"/>
-          <w:insideH w:val="single" w:sz="4" w:space="0" w:color="auto"/>
-          <w:insideV w:val="single" w:sz="4" w:space="0" w:color="auto"/>
-        </w:tblBorders>
-        <w:tblCellMar>
-          <w:left w:w="10" w:type="dxa"/>
-          <w:right w:w="10" w:type="dxa"/>
-        </w:tblCellMar>
-        <w:tblLook w:val="04A0" w:firstRow="1" w:lastRow="0" w:firstColumn="1" w:lastColumn="0" w:noHBand="0" w:noVBand="1"/>
-      </w:tblPr>
-      <w:tblGrid>
-        <w:gridCol w:w="9746"/>
-      </w:tblGrid>
-      <w:tr>
-        <w:trPr>
-          <w:trHeight w:val="2100"/>
-        </w:trPr>
-        <w:tc>
-          <w:tcPr>
-            <w:tcW w:w="9746" w:type="dxa"/>
-            <w:tcMar>
-              <w:top w:w="60" w:type="dxa"/>
-              <w:left w:w="100" w:type="dxa"/>
-              <w:bottom w:w="60" w:type="dxa"/>
-              <w:right w:w="100" w:type="dxa"/>
-            </w:tcMar>
-            <w:vAlign w:val="center"/>
-          </w:tcPr>
-          <w:p>
-            <w:pPr>
-              <w:spacing w:before="800" w:after="800"/>
-              <w:jc w:val="center"/>
-            </w:pPr>
-            <w:r>
-              <w:rPr>
-                <w:i/>
-                <w:iCs/>
-                <w:color w:val="8F9EAA"/>
-              </w:rPr>
-              <w:t xml:space="preserve">[ Pegue aquí la captura de </w:t>
-            </w:r>
-            <w:proofErr w:type="gramStart"/>
-            <w:r>
-              <w:rPr>
-                <w:i/>
-                <w:iCs/>
-                <w:color w:val="8F9EAA"/>
-              </w:rPr>
-              <w:t>pantalla ]</w:t>
-            </w:r>
-            <w:proofErr w:type="gramEnd"/>
-          </w:p>
-        </w:tc>
-      </w:tr>
-    </w:tbl>
-    <w:p>
-      <w:pPr>
-        <w:spacing w:after="160"/>
-      </w:pPr>
-    </w:p>
-    <w:p>
-      <w:pPr>
-        <w:spacing w:after="80" w:line="260" w:lineRule="auto"/>
-        <w:jc w:val="both"/>
-      </w:pPr>
-      <w:r>
-        <w:rPr>
-          <w:b/>
-          <w:bCs/>
-          <w:color w:val="D97A2B"/>
-        </w:rPr>
-        <w:t xml:space="preserve">Captura N.º 18: </w:t>
-      </w:r>
-      <w:r>
-        <w:t>la tabla comparativa de tiempos que usted construyó junto a la captura de la corrida donde se leen las duraciones.</w:t>
-      </w:r>
-    </w:p>
-    <w:tbl>
-      <w:tblPr>
-        <w:tblW w:w="9746" w:type="dxa"/>
-        <w:tblBorders>
-          <w:top w:val="dashed" w:sz="4" w:space="0" w:color="D6DEE5"/>
-          <w:left w:val="dashed" w:sz="4" w:space="0" w:color="D6DEE5"/>
-          <w:bottom w:val="dashed" w:sz="4" w:space="0" w:color="D6DEE5"/>
-          <w:right w:val="dashed" w:sz="4" w:space="0" w:color="D6DEE5"/>
-          <w:insideH w:val="single" w:sz="4" w:space="0" w:color="auto"/>
-          <w:insideV w:val="single" w:sz="4" w:space="0" w:color="auto"/>
-        </w:tblBorders>
-        <w:tblCellMar>
-          <w:left w:w="10" w:type="dxa"/>
-          <w:right w:w="10" w:type="dxa"/>
-        </w:tblCellMar>
-        <w:tblLook w:val="04A0" w:firstRow="1" w:lastRow="0" w:firstColumn="1" w:lastColumn="0" w:noHBand="0" w:noVBand="1"/>
-      </w:tblPr>
-      <w:tblGrid>
-        <w:gridCol w:w="9746"/>
-      </w:tblGrid>
-      <w:tr>
-        <w:trPr>
-          <w:trHeight w:val="2100"/>
-        </w:trPr>
-        <w:tc>
-          <w:tcPr>
-            <w:tcW w:w="9746" w:type="dxa"/>
-            <w:tcMar>
-              <w:top w:w="60" w:type="dxa"/>
-              <w:left w:w="100" w:type="dxa"/>
-              <w:bottom w:w="60" w:type="dxa"/>
-              <w:right w:w="100" w:type="dxa"/>
-            </w:tcMar>
-            <w:vAlign w:val="center"/>
-          </w:tcPr>
-          <w:p>
-            <w:pPr>
-              <w:spacing w:before="800" w:after="800"/>
-              <w:jc w:val="center"/>
-            </w:pPr>
-            <w:r>
-              <w:rPr>
-                <w:i/>
-                <w:iCs/>
-                <w:color w:val="8F9EAA"/>
-              </w:rPr>
-              <w:t xml:space="preserve">[ Pegue aquí la captura de </w:t>
-            </w:r>
-            <w:proofErr w:type="gramStart"/>
-            <w:r>
-              <w:rPr>
-                <w:i/>
-                <w:iCs/>
-                <w:color w:val="8F9EAA"/>
-              </w:rPr>
-              <w:t>pantalla ]</w:t>
-            </w:r>
-            <w:proofErr w:type="gramEnd"/>
-          </w:p>
-        </w:tc>
-      </w:tr>
-    </w:tbl>
-    <w:p>
-      <w:pPr>
-        <w:spacing w:after="160"/>
-      </w:pPr>
-    </w:p>
-    <w:p>
-      <w:pPr>
-        <w:spacing w:after="80" w:line="260" w:lineRule="auto"/>
-        <w:jc w:val="both"/>
-      </w:pPr>
-      <w:proofErr w:type="gramStart"/>
-      <w:r>
-        <w:rPr>
-          <w:b/>
-          <w:bCs/>
-          <w:color w:val="0F3D5C"/>
-        </w:rPr>
-        <w:t>Pregunta N.º</w:t>
-      </w:r>
-      <w:proofErr w:type="gramEnd"/>
-      <w:r>
-        <w:rPr>
-          <w:b/>
-          <w:bCs/>
-          <w:color w:val="0F3D5C"/>
-        </w:rPr>
-        <w:t xml:space="preserve"> 8. </w:t>
-      </w:r>
-      <w:r>
-        <w:rPr>
-          <w:b/>
-          <w:bCs/>
-        </w:rPr>
-        <w:t xml:space="preserve">Su pipeline tarda hoy cierto número de minutos. Si tardara cuarenta, ¿qué haría el equipo en la práctica y qué consecuencia tendría eso sobre la calidad del código que llega a </w:t>
-      </w:r>
-      <w:proofErr w:type="spellStart"/>
-      <w:r>
-        <w:rPr>
-          <w:b/>
-          <w:bCs/>
-        </w:rPr>
-        <w:t>main</w:t>
-      </w:r>
-      <w:proofErr w:type="spellEnd"/>
-      <w:r>
-        <w:rPr>
-          <w:b/>
-          <w:bCs/>
-        </w:rPr>
-        <w:t>?</w:t>
-      </w:r>
-    </w:p>
-    <w:tbl>
-      <w:tblPr>
-        <w:tblW w:w="9746" w:type="dxa"/>
-        <w:tblBorders>
-          <w:top w:val="single" w:sz="4" w:space="0" w:color="D6DEE5"/>
-          <w:left w:val="single" w:sz="4" w:space="0" w:color="D6DEE5"/>
-          <w:bottom w:val="single" w:sz="4" w:space="0" w:color="D6DEE5"/>
-          <w:right w:val="single" w:sz="4" w:space="0" w:color="D6DEE5"/>
-          <w:insideH w:val="single" w:sz="4" w:space="0" w:color="auto"/>
-          <w:insideV w:val="single" w:sz="4" w:space="0" w:color="auto"/>
-        </w:tblBorders>
-        <w:tblCellMar>
-          <w:left w:w="10" w:type="dxa"/>
-          <w:right w:w="10" w:type="dxa"/>
-        </w:tblCellMar>
-        <w:tblLook w:val="04A0" w:firstRow="1" w:lastRow="0" w:firstColumn="1" w:lastColumn="0" w:noHBand="0" w:noVBand="1"/>
-      </w:tblPr>
-      <w:tblGrid>
-        <w:gridCol w:w="9746"/>
-      </w:tblGrid>
-      <w:tr>
-        <w:trPr>
-          <w:trHeight w:val="1400"/>
-        </w:trPr>
-        <w:tc>
-          <w:tcPr>
-            <w:tcW w:w="9746" w:type="dxa"/>
-            <w:tcMar>
-              <w:top w:w="60" w:type="dxa"/>
-              <w:left w:w="100" w:type="dxa"/>
-              <w:bottom w:w="60" w:type="dxa"/>
-              <w:right w:w="100" w:type="dxa"/>
-            </w:tcMar>
-            <w:vAlign w:val="center"/>
-          </w:tcPr>
-          <w:p/>
-        </w:tc>
-      </w:tr>
-    </w:tbl>
-    <w:p>
-      <w:pPr>
-        <w:spacing w:after="160"/>
-      </w:pPr>
-    </w:p>
-    <w:p>
-      <w:pPr>
-        <w:pBdr>
-          <w:bottom w:val="single" w:sz="6" w:space="3" w:color="D6DEE5"/>
-        </w:pBdr>
-        <w:spacing w:before="300" w:after="120"/>
-      </w:pPr>
-      <w:r>
-        <w:rPr>
-          <w:b/>
-          <w:bCs/>
-          <w:color w:val="0F3D5C"/>
-          <w:sz w:val="24"/>
-          <w:szCs w:val="24"/>
-        </w:rPr>
         <w:t>Cierre de la Parte 1</w:t>
       </w:r>
     </w:p>
@@ -4324,7 +4431,6 @@
           <w:b/>
           <w:bCs/>
         </w:rPr>
-        <w:lastRenderedPageBreak/>
         <w:t>¿Qué error tuvo que resolver por su cuenta y cómo lo resolvió?</w:t>
       </w:r>
     </w:p>
@@ -4576,8 +4682,8 @@
     </w:tbl>
     <w:p/>
     <w:sectPr>
-      <w:headerReference w:type="default" r:id="rId19"/>
-      <w:footerReference w:type="default" r:id="rId20"/>
+      <w:headerReference w:type="default" r:id="rId21"/>
+      <w:footerReference w:type="default" r:id="rId22"/>
       <w:pgSz w:w="11906" w:h="16838"/>
       <w:pgMar w:top="1400" w:right="1080" w:bottom="1080" w:left="1080" w:header="560" w:footer="400" w:gutter="0"/>
       <w:cols w:space="720"/>
@@ -5543,6 +5649,7 @@
   <w:style w:type="character" w:default="1" w:styleId="Fuentedeprrafopredeter">
     <w:name w:val="Default Paragraph Font"/>
     <w:uiPriority w:val="1"/>
+    <w:semiHidden/>
     <w:unhideWhenUsed/>
   </w:style>
   <w:style w:type="table" w:default="1" w:styleId="Tablanormal">

</xml_diff>